<commit_message>
rendre qa reporting safe pour ecole et plus secure pour entreprise
</commit_message>
<xml_diff>
--- a/docs/Cahier-des-charges-QA-Reporting-J2EE-NOUVEAU.docx
+++ b/docs/Cahier-des-charges-QA-Reporting-J2EE-NOUVEAU.docx
@@ -185,7 +185,7 @@
                 <w:sz w:val="19"/>
                 <w:szCs w:val="19"/>
               </w:rPr>
-              <w:t xml:space="preserve">24 septembre 2026</w:t>
+              <w:t xml:space="preserve">25 septembre 2026</w:t>
             </w:r>
           </w:p>
         </w:tc>
@@ -397,7 +397,7 @@
         <w:spacing w:after="160"/>
       </w:pPr>
       <w:r>
-        <w:t xml:space="preserve">Cette version du document (V2.1, 24 septembre 2026) remplace la V2.0 du 21 septembre 2026. Elle intègre la vérification des droits et de la portée des données dans l'interface JSF, le journal d'audit alimenté et consultable, les pièces jointes et la déclaration d'anomalie depuis un test en échec dans l'interface, les rapports d'activité journalier / hebdomadaire / mensuel à l'écran, la rédaction de cas de test par les QA et l'interface bilingue. Elle relève aussi, au chapitre 10, les limites connues issues d'une revue métier.</w:t>
+        <w:t xml:space="preserve">Cette version du document (V2.3, 25 septembre 2026) ajoute le durcissement de la sécurité : règle de mot de passe, mot de passe provisoire à changer, blocage après échecs de connexion, renouvellement de la session, expiration des jetons d'API, désactivation des comptes au lieu de leur suppression, en-têtes de sécurité, HTTPS activable, identifiants de base hors du code et sauvegarde automatique. La V2.2 (24 septembre 2026) remplaçait la V2.1 du même jour, qui remplaçait la V2.0 du 21 septembre 2026. La V2.1 a apporté la vérification des droits et de la portée des données dans l'interface JSF, le journal d'audit, les pièces jointes et la déclaration d'anomalie depuis un test en échec, les rapports par période, la rédaction de cas de test par les QA et l'interface bilingue. La V2.2 corrige les écarts relevés par la revue métier de la V2.1 : validation de l'activité par le QA Lead, rappel quotidien effectif, cycle de vie complet des anomalies, campagnes figées hors exécution, assignation limitée à l'équipe ; elle ajoute la recherche et la pagination des listes et un jeu de données de démonstration.</w:t>
       </w:r>
     </w:p>
     <w:p>
@@ -679,6 +679,19 @@
       </w:pPr>
       <w:r>
         <w:t xml:space="preserve">Interface bilingue français / anglais, choix de langue mémorisé</w:t>
+      </w:r>
+    </w:p>
+    <w:p>
+      <w:pPr>
+        <w:pStyle w:val="Paragraphedeliste"/>
+        <w:numPr>
+          <w:ilvl w:val="0"/>
+          <w:numId w:val="2"/>
+        </w:numPr>
+        <w:spacing w:after="80"/>
+      </w:pPr>
+      <w:r>
+        <w:t xml:space="preserve">Recherche et pagination des listes ; jeu de données de démonstration chargeable par l'admin</w:t>
       </w:r>
     </w:p>
     <w:p>
@@ -1065,7 +1078,7 @@
                 <w:sz w:val="19"/>
                 <w:szCs w:val="19"/>
               </w:rPr>
-              <w:t xml:space="preserve">Crée les campagnes, répartit les tests et assigne les anomalies de l'équipe, suit l'activité de chaque testeur</w:t>
+              <w:t xml:space="preserve">Crée les campagnes, répartit les tests et assigne les anomalies de l'équipe, valide l'activité déclarée par chaque testeur</w:t>
             </w:r>
           </w:p>
         </w:tc>
@@ -1289,7 +1302,7 @@
         <w:spacing w:after="160"/>
       </w:pPr>
       <w:r>
-        <w:t xml:space="preserve">Connexion par email / mot de passe. Un jeton opaque est généré à la connexion, dont seul le hachage SHA-256 est stocké — jamais le jeton en clair — puis vérifié sur chaque requête par un ContainerRequestFilter JAX-RS, avant même d'atteindre la ressource ciblée. Un intercepteur CDI (@RequiresRole) bloque ensuite l'accès si le rôle de l'utilisateur ne correspond pas à celui attendu par l'action. Côté interface JSF, la session est portée par un bean @SessionScoped (SessionAuth) et un filtre de servlet (AccessFilter) redirige vers la connexion toute page protégée demandée sans session valide. Les deux interfaces lisent une même matrice des permissions (classe Permissions) : dans l'interface JSF, elle est appliquée par le filtre des pages, revérifiée par chaque action des beans (refus 403 même pour un formulaire forgé) et masque les boutons non autorisés. La portée des données est contrôlée objet par objet (méthodes canView des services) : un objet hors du périmètre du rôle répond 404, par l'API comme par l'URL d'une page.</w:t>
+        <w:t xml:space="preserve">Connexion par email / mot de passe. Un jeton opaque est généré à la connexion, dont seul le hachage SHA-256 est stocké — jamais le jeton en clair — puis vérifié sur chaque requête par un ContainerRequestFilter JAX-RS, avant même d'atteindre la ressource ciblée. Un intercepteur CDI (@RequiresRole) bloque ensuite l'accès si le rôle de l'utilisateur ne correspond pas à celui attendu par l'action. Côté interface JSF, la session est portée par un bean @SessionScoped (SessionAuth) et un filtre de servlet (AccessFilter) redirige vers la connexion toute page protégée demandée sans session valide. Les deux interfaces lisent une même matrice des permissions (classe Permissions) : dans l'interface JSF, elle est appliquée par le filtre des pages, revérifiée par chaque action des beans (refus 403 même pour un formulaire forgé) et masque les boutons non autorisés. La portée des données est contrôlée objet par objet (méthodes canView des services) : un objet hors du périmètre du rôle répond 404, par l'API comme par l'URL d'une page. La connexion est protégée contre les essais répétés (blocage de 15 minutes après 5 échecs sur un compte, ou 20 depuis une même adresse IP) et ne révèle jamais si un compte existe. L'identifiant de session est renouvelé à chaque connexion ; un jeton d'API expire après 12 heures, ou 2 heures sans utilisation, et la déconnexion le révoque.</w:t>
       </w:r>
     </w:p>
     <w:p>
@@ -1337,7 +1350,7 @@
         <w:spacing w:after="160"/>
       </w:pPr>
       <w:r>
-        <w:t xml:space="preserve">Un projet regroupe des campagnes de test. Une campagne suit un cycle planned → in_progress → completed / blocked, représenté par une énumération Java, à l'identique de l'enum SQL côté Laravel.</w:t>
+        <w:t xml:space="preserve">Un projet regroupe des campagnes de test. Une campagne suit un cycle planned → in_progress → completed / blocked, représenté par une énumération Java. Les tests d'une campagne ne s'exécutent que lorsqu'elle est en cours : une campagne planifiée n'a pas démarré, une campagne bloquée attend sa reprise, une campagne terminée est figée et ses résultats ne bougent plus. Le QA Lead démarre, bloque, reprend et termine les campagnes ; l'équipe est notifiée à chaque changement.</w:t>
       </w:r>
     </w:p>
     <w:p>
@@ -1385,7 +1398,7 @@
         <w:spacing w:after="160"/>
       </w:pPr>
       <w:r>
-        <w:t xml:space="preserve">Cycle de vie avec sévérité, priorité, assignation, pièces jointes et historique horodaté de chaque changement d'état (entité DefectHistory, jamais modifiée après coup). Une anomalie corrigée est revérifiée : une revérification réussie la ferme, une revérification en échec la rouvre. Les pièces jointes (captures, vidéos MP4, PDF, journaux texte / CSV / JSON, archives ZIP ; 10 Mo maximum) se déposent, se téléchargent et se retirent depuis la fiche de l'anomalie comme depuis l'API ; seul l'auteur d'une pièce jointe ou l'admin peut la retirer, et le nom de fichier fourni est assaini avant tout enregistrement sur disque.</w:t>
+        <w:t xml:space="preserve">Cycle de vie complet, avec sévérité, priorité, assignation, pièces jointes et historique horodaté de chaque changement d'état (entité DefectHistory, jamais modifiée après coup) : ouverte → en cours (prise en charge) → corrigée → à revérifier → fermée si la revérification réussit, rouverte si elle échoue. Une anomalie peut aussi être fermée directement, mais seulement avec un motif (doublon, non reproductible…). Elle ne s'assigne qu'à un testeur (QA ou QA Lead) de l'équipe du projet. Les pièces jointes (captures, vidéos MP4, PDF, journaux texte / CSV / JSON, archives ZIP ; 10 Mo maximum) se déposent, se téléchargent et se retirent depuis la fiche comme depuis l'API ; seul leur auteur ou l'admin peut les retirer, et le nom de fichier fourni est assaini avant tout enregistrement sur disque.</w:t>
       </w:r>
     </w:p>
     <w:p>
@@ -1409,7 +1422,7 @@
         <w:spacing w:after="160"/>
       </w:pPr>
       <w:r>
-        <w:t xml:space="preserve">Chaque QA déclare son activité du jour. Règle métier appliquée côté serveur : passed + failed + blocked + not_run doit toujours être égal au nombre de tests exécutés déclarés — vérifiée en Java dans le service applicatif avant persistance, sous peine d'erreur 422 explicite.</w:t>
+        <w:t xml:space="preserve">Chaque QA déclare son activité du jour. Règle métier appliquée côté serveur : passed + failed + blocked + not_run doit toujours être égal au nombre de tests exécutés déclarés — vérifiée en Java dans le service applicatif avant persistance, sous peine d'erreur 422 explicite. Le QA Lead valide ensuite les déclarations de son équipe (écran « Activité de l'équipe », tuile « Activités à valider » du tableau de bord) ; une déclaration validée n'est plus modifiable par son auteur. Chaque testeur peut activer un rappel quotidien : à l'heure choisie, s'il n'a rien déclaré dans la journée, il reçoit une notification (timer EJB exécuté chaque minute, une seule notification par jour).</w:t>
       </w:r>
     </w:p>
     <w:p>
@@ -1457,7 +1470,7 @@
         <w:spacing w:after="160"/>
       </w:pPr>
       <w:r>
-        <w:t xml:space="preserve">Générées automatiquement sur les événements clés : démarrage / fin / blocage de campagne, assignation d'anomalie. Consultables et marquables comme lues, depuis l'API comme depuis l'écran dédié de l'interface JSF. Les notifications générées par l'application s'affichent dans la langue de l'utilisateur.</w:t>
+        <w:t xml:space="preserve">Générées automatiquement sur les événements clés : démarrage / fin / blocage de campagne, assignation et correction d'anomalie, rappel quotidien de saisie. Consultables et marquables comme lues, depuis l'API comme depuis l'écran dédié de l'interface JSF, dans la langue de l'utilisateur. Chaque type se désactive dans les paramètres personnels.</w:t>
       </w:r>
     </w:p>
     <w:p>
@@ -3848,7 +3861,7 @@
                 <w:sz w:val="19"/>
                 <w:szCs w:val="19"/>
               </w:rPr>
-              <w:t xml:space="preserve">Voir le reporting équipe</w:t>
+              <w:t xml:space="preserve">Valider l'activité de l'équipe</w:t>
             </w:r>
           </w:p>
         </w:tc>
@@ -3861,41 +3874,7 @@
               <w:bottom w:val="single" w:sz="4" w:space="0" w:color="D8DCE3"/>
               <w:right w:val="single" w:sz="4" w:space="0" w:color="D8DCE3"/>
             </w:tcBorders>
-            <w:shd w:val="clear" w:color="auto" w:fill="F7F8FA"/>
-            <w:tcMar>
-              <w:top w:w="90" w:type="dxa"/>
-              <w:left w:w="120" w:type="dxa"/>
-              <w:bottom w:w="90" w:type="dxa"/>
-              <w:right w:w="120" w:type="dxa"/>
-            </w:tcMar>
-            <w:vAlign w:val="center"/>
-          </w:tcPr>
-          <w:p>
-            <w:pPr>
-              <w:jc w:val="center"/>
-            </w:pPr>
-            <w:r>
-              <w:rPr>
-                <w:i/>
-                <w:iCs/>
-                <w:color w:val="5B6472"/>
-                <w:sz w:val="19"/>
-                <w:szCs w:val="19"/>
-              </w:rPr>
-              <w:t xml:space="preserve">propre activité</w:t>
-            </w:r>
-          </w:p>
-        </w:tc>
-        <w:tc>
-          <w:tcPr>
-            <w:tcW w:w="1727" w:type="dxa"/>
-            <w:tcBorders>
-              <w:top w:val="single" w:sz="4" w:space="0" w:color="D8DCE3"/>
-              <w:left w:val="single" w:sz="4" w:space="0" w:color="D8DCE3"/>
-              <w:bottom w:val="single" w:sz="4" w:space="0" w:color="D8DCE3"/>
-              <w:right w:val="single" w:sz="4" w:space="0" w:color="D8DCE3"/>
-            </w:tcBorders>
-            <w:shd w:val="clear" w:color="auto" w:fill="E7F0E9"/>
+            <w:shd w:val="clear" w:color="auto" w:fill="FFFFFF"/>
             <w:tcMar>
               <w:top w:w="80" w:type="dxa"/>
               <w:left w:w="80" w:type="dxa"/>
@@ -3910,13 +3889,11 @@
             </w:pPr>
             <w:r>
               <w:rPr>
-                <w:b/>
-                <w:bCs/>
-                <w:color w:val="2E7D4F"/>
+                <w:color w:val="98A1AE"/>
                 <w:sz w:val="20"/>
                 <w:szCs w:val="20"/>
               </w:rPr>
-              <w:t>✓</w:t>
+              <w:t xml:space="preserve">—</w:t>
             </w:r>
           </w:p>
         </w:tc>
@@ -3950,7 +3927,7 @@
                 <w:sz w:val="20"/>
                 <w:szCs w:val="20"/>
               </w:rPr>
-              <w:t>✓</w:t>
+              <w:t xml:space="preserve">✓</w:t>
             </w:r>
           </w:p>
         </w:tc>
@@ -3963,7 +3940,7 @@
               <w:bottom w:val="single" w:sz="4" w:space="0" w:color="D8DCE3"/>
               <w:right w:val="single" w:sz="4" w:space="0" w:color="D8DCE3"/>
             </w:tcBorders>
-            <w:shd w:val="clear" w:color="auto" w:fill="E7F0E9"/>
+            <w:shd w:val="clear" w:color="auto" w:fill="FFFFFF"/>
             <w:tcMar>
               <w:top w:w="80" w:type="dxa"/>
               <w:left w:w="80" w:type="dxa"/>
@@ -3978,44 +3955,11 @@
             </w:pPr>
             <w:r>
               <w:rPr>
-                <w:b/>
-                <w:bCs/>
-                <w:color w:val="2E7D4F"/>
+                <w:color w:val="98A1AE"/>
                 <w:sz w:val="20"/>
                 <w:szCs w:val="20"/>
               </w:rPr>
-              <w:t>✓</w:t>
-            </w:r>
-          </w:p>
-        </w:tc>
-      </w:tr>
-      <w:tr>
-        <w:tc>
-          <w:tcPr>
-            <w:tcW w:w="3000" w:type="dxa"/>
-            <w:tcBorders>
-              <w:top w:val="single" w:sz="4" w:space="0" w:color="D8DCE3"/>
-              <w:left w:val="single" w:sz="4" w:space="0" w:color="D8DCE3"/>
-              <w:bottom w:val="single" w:sz="4" w:space="0" w:color="D8DCE3"/>
-              <w:right w:val="single" w:sz="4" w:space="0" w:color="D8DCE3"/>
-            </w:tcBorders>
-            <w:tcMar>
-              <w:top w:w="90" w:type="dxa"/>
-              <w:left w:w="120" w:type="dxa"/>
-              <w:bottom w:w="90" w:type="dxa"/>
-              <w:right w:w="120" w:type="dxa"/>
-            </w:tcMar>
-            <w:vAlign w:val="center"/>
-          </w:tcPr>
-          <w:p>
-            <w:r>
-              <w:rPr>
-                <w:b/>
-                <w:bCs/>
-                <w:sz w:val="19"/>
-                <w:szCs w:val="19"/>
-              </w:rPr>
-              <w:t xml:space="preserve">Voir le reporting global</w:t>
+              <w:t xml:space="preserve">—</w:t>
             </w:r>
           </w:p>
         </w:tc>
@@ -4028,7 +3972,7 @@
               <w:bottom w:val="single" w:sz="4" w:space="0" w:color="D8DCE3"/>
               <w:right w:val="single" w:sz="4" w:space="0" w:color="D8DCE3"/>
             </w:tcBorders>
-            <w:shd w:val="clear" w:color="auto" w:fill="FFFFFF"/>
+            <w:shd w:val="clear" w:color="auto" w:fill="E7F0E9"/>
             <w:tcMar>
               <w:top w:w="80" w:type="dxa"/>
               <w:left w:w="80" w:type="dxa"/>
@@ -4043,11 +3987,45 @@
             </w:pPr>
             <w:r>
               <w:rPr>
-                <w:color w:val="98A1AE"/>
+                <w:b/>
+                <w:bCs/>
+                <w:color w:val="2E7D4F"/>
                 <w:sz w:val="20"/>
                 <w:szCs w:val="20"/>
               </w:rPr>
-              <w:t>—</w:t>
+              <w:t xml:space="preserve">✓</w:t>
+            </w:r>
+          </w:p>
+        </w:tc>
+      </w:tr>
+      <w:tr>
+        <w:tc>
+          <w:tcPr>
+            <w:tcW w:w="3000" w:type="dxa"/>
+            <w:tcBorders>
+              <w:top w:val="single" w:sz="4" w:space="0" w:color="D8DCE3"/>
+              <w:left w:val="single" w:sz="4" w:space="0" w:color="D8DCE3"/>
+              <w:bottom w:val="single" w:sz="4" w:space="0" w:color="D8DCE3"/>
+              <w:right w:val="single" w:sz="4" w:space="0" w:color="D8DCE3"/>
+            </w:tcBorders>
+            <w:shd w:val="clear" w:color="auto" w:fill="F7F8FA"/>
+            <w:tcMar>
+              <w:top w:w="90" w:type="dxa"/>
+              <w:left w:w="120" w:type="dxa"/>
+              <w:bottom w:w="90" w:type="dxa"/>
+              <w:right w:w="120" w:type="dxa"/>
+            </w:tcMar>
+            <w:vAlign w:val="center"/>
+          </w:tcPr>
+          <w:p>
+            <w:r>
+              <w:rPr>
+                <w:b/>
+                <w:bCs/>
+                <w:sz w:val="19"/>
+                <w:szCs w:val="19"/>
+              </w:rPr>
+              <w:t xml:space="preserve">Voir le reporting équipe</w:t>
             </w:r>
           </w:p>
         </w:tc>
@@ -4060,7 +4038,41 @@
               <w:bottom w:val="single" w:sz="4" w:space="0" w:color="D8DCE3"/>
               <w:right w:val="single" w:sz="4" w:space="0" w:color="D8DCE3"/>
             </w:tcBorders>
-            <w:shd w:val="clear" w:color="auto" w:fill="FFFFFF"/>
+            <w:shd w:val="clear" w:color="auto" w:fill="F7F8FA"/>
+            <w:tcMar>
+              <w:top w:w="90" w:type="dxa"/>
+              <w:left w:w="120" w:type="dxa"/>
+              <w:bottom w:w="90" w:type="dxa"/>
+              <w:right w:w="120" w:type="dxa"/>
+            </w:tcMar>
+            <w:vAlign w:val="center"/>
+          </w:tcPr>
+          <w:p>
+            <w:pPr>
+              <w:jc w:val="center"/>
+            </w:pPr>
+            <w:r>
+              <w:rPr>
+                <w:i/>
+                <w:iCs/>
+                <w:color w:val="5B6472"/>
+                <w:sz w:val="19"/>
+                <w:szCs w:val="19"/>
+              </w:rPr>
+              <w:t xml:space="preserve">propre activité</w:t>
+            </w:r>
+          </w:p>
+        </w:tc>
+        <w:tc>
+          <w:tcPr>
+            <w:tcW w:w="1727" w:type="dxa"/>
+            <w:tcBorders>
+              <w:top w:val="single" w:sz="4" w:space="0" w:color="D8DCE3"/>
+              <w:left w:val="single" w:sz="4" w:space="0" w:color="D8DCE3"/>
+              <w:bottom w:val="single" w:sz="4" w:space="0" w:color="D8DCE3"/>
+              <w:right w:val="single" w:sz="4" w:space="0" w:color="D8DCE3"/>
+            </w:tcBorders>
+            <w:shd w:val="clear" w:color="auto" w:fill="E7F0E9"/>
             <w:tcMar>
               <w:top w:w="80" w:type="dxa"/>
               <w:left w:w="80" w:type="dxa"/>
@@ -4075,11 +4087,13 @@
             </w:pPr>
             <w:r>
               <w:rPr>
-                <w:color w:val="98A1AE"/>
+                <w:b/>
+                <w:bCs/>
+                <w:color w:val="2E7D4F"/>
                 <w:sz w:val="20"/>
                 <w:szCs w:val="20"/>
               </w:rPr>
-              <w:t>—</w:t>
+              <w:t>✓</w:t>
             </w:r>
           </w:p>
         </w:tc>
@@ -4162,24 +4176,23 @@
               <w:bottom w:val="single" w:sz="4" w:space="0" w:color="D8DCE3"/>
               <w:right w:val="single" w:sz="4" w:space="0" w:color="D8DCE3"/>
             </w:tcBorders>
-            <w:shd w:val="clear" w:color="auto" w:fill="F7F8FA"/>
-            <w:tcMar>
-              <w:top w:w="90" w:type="dxa"/>
-              <w:left w:w="120" w:type="dxa"/>
-              <w:bottom w:w="90" w:type="dxa"/>
-              <w:right w:w="120" w:type="dxa"/>
-            </w:tcMar>
-            <w:vAlign w:val="center"/>
-          </w:tcPr>
-          <w:p>
-            <w:r>
-              <w:rPr>
-                <w:b/>
-                <w:bCs/>
-                <w:sz w:val="19"/>
-                <w:szCs w:val="19"/>
-              </w:rPr>
-              <w:t>Exporter (CSV / Excel)</w:t>
+            <w:tcMar>
+              <w:top w:w="90" w:type="dxa"/>
+              <w:left w:w="120" w:type="dxa"/>
+              <w:bottom w:w="90" w:type="dxa"/>
+              <w:right w:w="120" w:type="dxa"/>
+            </w:tcMar>
+            <w:vAlign w:val="center"/>
+          </w:tcPr>
+          <w:p>
+            <w:r>
+              <w:rPr>
+                <w:b/>
+                <w:bCs/>
+                <w:sz w:val="19"/>
+                <w:szCs w:val="19"/>
+              </w:rPr>
+              <w:t xml:space="preserve">Voir le reporting global</w:t>
             </w:r>
           </w:p>
         </w:tc>
@@ -4192,75 +4205,7 @@
               <w:bottom w:val="single" w:sz="4" w:space="0" w:color="D8DCE3"/>
               <w:right w:val="single" w:sz="4" w:space="0" w:color="D8DCE3"/>
             </w:tcBorders>
-            <w:shd w:val="clear" w:color="auto" w:fill="F7F8FA"/>
-            <w:tcMar>
-              <w:top w:w="90" w:type="dxa"/>
-              <w:left w:w="120" w:type="dxa"/>
-              <w:bottom w:w="90" w:type="dxa"/>
-              <w:right w:w="120" w:type="dxa"/>
-            </w:tcMar>
-            <w:vAlign w:val="center"/>
-          </w:tcPr>
-          <w:p>
-            <w:pPr>
-              <w:jc w:val="center"/>
-            </w:pPr>
-            <w:r>
-              <w:rPr>
-                <w:i/>
-                <w:iCs/>
-                <w:color w:val="5B6472"/>
-                <w:sz w:val="19"/>
-                <w:szCs w:val="19"/>
-              </w:rPr>
-              <w:t xml:space="preserve">propres données</w:t>
-            </w:r>
-          </w:p>
-        </w:tc>
-        <w:tc>
-          <w:tcPr>
-            <w:tcW w:w="1727" w:type="dxa"/>
-            <w:tcBorders>
-              <w:top w:val="single" w:sz="4" w:space="0" w:color="D8DCE3"/>
-              <w:left w:val="single" w:sz="4" w:space="0" w:color="D8DCE3"/>
-              <w:bottom w:val="single" w:sz="4" w:space="0" w:color="D8DCE3"/>
-              <w:right w:val="single" w:sz="4" w:space="0" w:color="D8DCE3"/>
-            </w:tcBorders>
-            <w:shd w:val="clear" w:color="auto" w:fill="F7F8FA"/>
-            <w:tcMar>
-              <w:top w:w="90" w:type="dxa"/>
-              <w:left w:w="120" w:type="dxa"/>
-              <w:bottom w:w="90" w:type="dxa"/>
-              <w:right w:w="120" w:type="dxa"/>
-            </w:tcMar>
-            <w:vAlign w:val="center"/>
-          </w:tcPr>
-          <w:p>
-            <w:pPr>
-              <w:jc w:val="center"/>
-            </w:pPr>
-            <w:r>
-              <w:rPr>
-                <w:i/>
-                <w:iCs/>
-                <w:color w:val="5B6472"/>
-                <w:sz w:val="19"/>
-                <w:szCs w:val="19"/>
-              </w:rPr>
-              <w:t xml:space="preserve">son équipe</w:t>
-            </w:r>
-          </w:p>
-        </w:tc>
-        <w:tc>
-          <w:tcPr>
-            <w:tcW w:w="1727" w:type="dxa"/>
-            <w:tcBorders>
-              <w:top w:val="single" w:sz="4" w:space="0" w:color="D8DCE3"/>
-              <w:left w:val="single" w:sz="4" w:space="0" w:color="D8DCE3"/>
-              <w:bottom w:val="single" w:sz="4" w:space="0" w:color="D8DCE3"/>
-              <w:right w:val="single" w:sz="4" w:space="0" w:color="D8DCE3"/>
-            </w:tcBorders>
-            <w:shd w:val="clear" w:color="auto" w:fill="E7F0E9"/>
+            <w:shd w:val="clear" w:color="auto" w:fill="FFFFFF"/>
             <w:tcMar>
               <w:top w:w="80" w:type="dxa"/>
               <w:left w:w="80" w:type="dxa"/>
@@ -4275,13 +4220,11 @@
             </w:pPr>
             <w:r>
               <w:rPr>
-                <w:b/>
-                <w:bCs/>
-                <w:color w:val="2E7D4F"/>
+                <w:color w:val="98A1AE"/>
                 <w:sz w:val="20"/>
                 <w:szCs w:val="20"/>
               </w:rPr>
-              <w:t>✓</w:t>
+              <w:t>—</w:t>
             </w:r>
           </w:p>
         </w:tc>
@@ -4294,7 +4237,7 @@
               <w:bottom w:val="single" w:sz="4" w:space="0" w:color="D8DCE3"/>
               <w:right w:val="single" w:sz="4" w:space="0" w:color="D8DCE3"/>
             </w:tcBorders>
-            <w:shd w:val="clear" w:color="auto" w:fill="E7F0E9"/>
+            <w:shd w:val="clear" w:color="auto" w:fill="FFFFFF"/>
             <w:tcMar>
               <w:top w:w="80" w:type="dxa"/>
               <w:left w:w="80" w:type="dxa"/>
@@ -4309,6 +4252,38 @@
             </w:pPr>
             <w:r>
               <w:rPr>
+                <w:color w:val="98A1AE"/>
+                <w:sz w:val="20"/>
+                <w:szCs w:val="20"/>
+              </w:rPr>
+              <w:t>—</w:t>
+            </w:r>
+          </w:p>
+        </w:tc>
+        <w:tc>
+          <w:tcPr>
+            <w:tcW w:w="1727" w:type="dxa"/>
+            <w:tcBorders>
+              <w:top w:val="single" w:sz="4" w:space="0" w:color="D8DCE3"/>
+              <w:left w:val="single" w:sz="4" w:space="0" w:color="D8DCE3"/>
+              <w:bottom w:val="single" w:sz="4" w:space="0" w:color="D8DCE3"/>
+              <w:right w:val="single" w:sz="4" w:space="0" w:color="D8DCE3"/>
+            </w:tcBorders>
+            <w:shd w:val="clear" w:color="auto" w:fill="E7F0E9"/>
+            <w:tcMar>
+              <w:top w:w="80" w:type="dxa"/>
+              <w:left w:w="80" w:type="dxa"/>
+              <w:bottom w:w="80" w:type="dxa"/>
+              <w:right w:w="80" w:type="dxa"/>
+            </w:tcMar>
+            <w:vAlign w:val="center"/>
+          </w:tcPr>
+          <w:p>
+            <w:pPr>
+              <w:jc w:val="center"/>
+            </w:pPr>
+            <w:r>
+              <w:rPr>
                 <w:b/>
                 <w:bCs/>
                 <w:color w:val="2E7D4F"/>
@@ -4319,6 +4294,40 @@
             </w:r>
           </w:p>
         </w:tc>
+        <w:tc>
+          <w:tcPr>
+            <w:tcW w:w="1727" w:type="dxa"/>
+            <w:tcBorders>
+              <w:top w:val="single" w:sz="4" w:space="0" w:color="D8DCE3"/>
+              <w:left w:val="single" w:sz="4" w:space="0" w:color="D8DCE3"/>
+              <w:bottom w:val="single" w:sz="4" w:space="0" w:color="D8DCE3"/>
+              <w:right w:val="single" w:sz="4" w:space="0" w:color="D8DCE3"/>
+            </w:tcBorders>
+            <w:shd w:val="clear" w:color="auto" w:fill="E7F0E9"/>
+            <w:tcMar>
+              <w:top w:w="80" w:type="dxa"/>
+              <w:left w:w="80" w:type="dxa"/>
+              <w:bottom w:w="80" w:type="dxa"/>
+              <w:right w:w="80" w:type="dxa"/>
+            </w:tcMar>
+            <w:vAlign w:val="center"/>
+          </w:tcPr>
+          <w:p>
+            <w:pPr>
+              <w:jc w:val="center"/>
+            </w:pPr>
+            <w:r>
+              <w:rPr>
+                <w:b/>
+                <w:bCs/>
+                <w:color w:val="2E7D4F"/>
+                <w:sz w:val="20"/>
+                <w:szCs w:val="20"/>
+              </w:rPr>
+              <w:t>✓</w:t>
+            </w:r>
+          </w:p>
+        </w:tc>
       </w:tr>
       <w:tr>
         <w:tc>
@@ -4330,23 +4339,191 @@
               <w:bottom w:val="single" w:sz="4" w:space="0" w:color="D8DCE3"/>
               <w:right w:val="single" w:sz="4" w:space="0" w:color="D8DCE3"/>
             </w:tcBorders>
-            <w:tcMar>
-              <w:top w:w="90" w:type="dxa"/>
-              <w:left w:w="120" w:type="dxa"/>
-              <w:bottom w:w="90" w:type="dxa"/>
-              <w:right w:w="120" w:type="dxa"/>
-            </w:tcMar>
-            <w:vAlign w:val="center"/>
-          </w:tcPr>
-          <w:p>
-            <w:r>
-              <w:rPr>
-                <w:b/>
-                <w:bCs/>
-                <w:sz w:val="19"/>
-                <w:szCs w:val="19"/>
-              </w:rPr>
-              <w:t xml:space="preserve">Supprimer (tests, anomalies, référentiels)</w:t>
+            <w:shd w:val="clear" w:color="auto" w:fill="F7F8FA"/>
+            <w:tcMar>
+              <w:top w:w="90" w:type="dxa"/>
+              <w:left w:w="120" w:type="dxa"/>
+              <w:bottom w:w="90" w:type="dxa"/>
+              <w:right w:w="120" w:type="dxa"/>
+            </w:tcMar>
+            <w:vAlign w:val="center"/>
+          </w:tcPr>
+          <w:p>
+            <w:r>
+              <w:rPr>
+                <w:b/>
+                <w:bCs/>
+                <w:sz w:val="19"/>
+                <w:szCs w:val="19"/>
+              </w:rPr>
+              <w:t>Exporter (CSV / Excel)</w:t>
+            </w:r>
+          </w:p>
+        </w:tc>
+        <w:tc>
+          <w:tcPr>
+            <w:tcW w:w="1727" w:type="dxa"/>
+            <w:tcBorders>
+              <w:top w:val="single" w:sz="4" w:space="0" w:color="D8DCE3"/>
+              <w:left w:val="single" w:sz="4" w:space="0" w:color="D8DCE3"/>
+              <w:bottom w:val="single" w:sz="4" w:space="0" w:color="D8DCE3"/>
+              <w:right w:val="single" w:sz="4" w:space="0" w:color="D8DCE3"/>
+            </w:tcBorders>
+            <w:shd w:val="clear" w:color="auto" w:fill="F7F8FA"/>
+            <w:tcMar>
+              <w:top w:w="90" w:type="dxa"/>
+              <w:left w:w="120" w:type="dxa"/>
+              <w:bottom w:w="90" w:type="dxa"/>
+              <w:right w:w="120" w:type="dxa"/>
+            </w:tcMar>
+            <w:vAlign w:val="center"/>
+          </w:tcPr>
+          <w:p>
+            <w:pPr>
+              <w:jc w:val="center"/>
+            </w:pPr>
+            <w:r>
+              <w:rPr>
+                <w:i/>
+                <w:iCs/>
+                <w:color w:val="5B6472"/>
+                <w:sz w:val="19"/>
+                <w:szCs w:val="19"/>
+              </w:rPr>
+              <w:t xml:space="preserve">propres données</w:t>
+            </w:r>
+          </w:p>
+        </w:tc>
+        <w:tc>
+          <w:tcPr>
+            <w:tcW w:w="1727" w:type="dxa"/>
+            <w:tcBorders>
+              <w:top w:val="single" w:sz="4" w:space="0" w:color="D8DCE3"/>
+              <w:left w:val="single" w:sz="4" w:space="0" w:color="D8DCE3"/>
+              <w:bottom w:val="single" w:sz="4" w:space="0" w:color="D8DCE3"/>
+              <w:right w:val="single" w:sz="4" w:space="0" w:color="D8DCE3"/>
+            </w:tcBorders>
+            <w:shd w:val="clear" w:color="auto" w:fill="F7F8FA"/>
+            <w:tcMar>
+              <w:top w:w="90" w:type="dxa"/>
+              <w:left w:w="120" w:type="dxa"/>
+              <w:bottom w:w="90" w:type="dxa"/>
+              <w:right w:w="120" w:type="dxa"/>
+            </w:tcMar>
+            <w:vAlign w:val="center"/>
+          </w:tcPr>
+          <w:p>
+            <w:pPr>
+              <w:jc w:val="center"/>
+            </w:pPr>
+            <w:r>
+              <w:rPr>
+                <w:i/>
+                <w:iCs/>
+                <w:color w:val="5B6472"/>
+                <w:sz w:val="19"/>
+                <w:szCs w:val="19"/>
+              </w:rPr>
+              <w:t xml:space="preserve">son équipe</w:t>
+            </w:r>
+          </w:p>
+        </w:tc>
+        <w:tc>
+          <w:tcPr>
+            <w:tcW w:w="1727" w:type="dxa"/>
+            <w:tcBorders>
+              <w:top w:val="single" w:sz="4" w:space="0" w:color="D8DCE3"/>
+              <w:left w:val="single" w:sz="4" w:space="0" w:color="D8DCE3"/>
+              <w:bottom w:val="single" w:sz="4" w:space="0" w:color="D8DCE3"/>
+              <w:right w:val="single" w:sz="4" w:space="0" w:color="D8DCE3"/>
+            </w:tcBorders>
+            <w:shd w:val="clear" w:color="auto" w:fill="E7F0E9"/>
+            <w:tcMar>
+              <w:top w:w="80" w:type="dxa"/>
+              <w:left w:w="80" w:type="dxa"/>
+              <w:bottom w:w="80" w:type="dxa"/>
+              <w:right w:w="80" w:type="dxa"/>
+            </w:tcMar>
+            <w:vAlign w:val="center"/>
+          </w:tcPr>
+          <w:p>
+            <w:pPr>
+              <w:jc w:val="center"/>
+            </w:pPr>
+            <w:r>
+              <w:rPr>
+                <w:b/>
+                <w:bCs/>
+                <w:color w:val="2E7D4F"/>
+                <w:sz w:val="20"/>
+                <w:szCs w:val="20"/>
+              </w:rPr>
+              <w:t>✓</w:t>
+            </w:r>
+          </w:p>
+        </w:tc>
+        <w:tc>
+          <w:tcPr>
+            <w:tcW w:w="1727" w:type="dxa"/>
+            <w:tcBorders>
+              <w:top w:val="single" w:sz="4" w:space="0" w:color="D8DCE3"/>
+              <w:left w:val="single" w:sz="4" w:space="0" w:color="D8DCE3"/>
+              <w:bottom w:val="single" w:sz="4" w:space="0" w:color="D8DCE3"/>
+              <w:right w:val="single" w:sz="4" w:space="0" w:color="D8DCE3"/>
+            </w:tcBorders>
+            <w:shd w:val="clear" w:color="auto" w:fill="E7F0E9"/>
+            <w:tcMar>
+              <w:top w:w="80" w:type="dxa"/>
+              <w:left w:w="80" w:type="dxa"/>
+              <w:bottom w:w="80" w:type="dxa"/>
+              <w:right w:w="80" w:type="dxa"/>
+            </w:tcMar>
+            <w:vAlign w:val="center"/>
+          </w:tcPr>
+          <w:p>
+            <w:pPr>
+              <w:jc w:val="center"/>
+            </w:pPr>
+            <w:r>
+              <w:rPr>
+                <w:b/>
+                <w:bCs/>
+                <w:color w:val="2E7D4F"/>
+                <w:sz w:val="20"/>
+                <w:szCs w:val="20"/>
+              </w:rPr>
+              <w:t>✓</w:t>
+            </w:r>
+          </w:p>
+        </w:tc>
+      </w:tr>
+      <w:tr>
+        <w:tc>
+          <w:tcPr>
+            <w:tcW w:w="3000" w:type="dxa"/>
+            <w:tcBorders>
+              <w:top w:val="single" w:sz="4" w:space="0" w:color="D8DCE3"/>
+              <w:left w:val="single" w:sz="4" w:space="0" w:color="D8DCE3"/>
+              <w:bottom w:val="single" w:sz="4" w:space="0" w:color="D8DCE3"/>
+              <w:right w:val="single" w:sz="4" w:space="0" w:color="D8DCE3"/>
+            </w:tcBorders>
+            <w:tcMar>
+              <w:top w:w="90" w:type="dxa"/>
+              <w:left w:w="120" w:type="dxa"/>
+              <w:bottom w:w="90" w:type="dxa"/>
+              <w:right w:w="120" w:type="dxa"/>
+            </w:tcMar>
+            <w:vAlign w:val="center"/>
+          </w:tcPr>
+          <w:p>
+            <w:r>
+              <w:rPr>
+                <w:b/>
+                <w:bCs/>
+                <w:sz w:val="19"/>
+                <w:szCs w:val="19"/>
+              </w:rPr>
+              <w:t xml:space="preserve">Supprimer (tests, anomalies, référentiels), désactiver un compte</w:t>
             </w:r>
           </w:p>
         </w:tc>
@@ -4706,7 +4883,7 @@
         <w:spacing w:after="160"/>
       </w:pPr>
       <w:r>
-        <w:t xml:space="preserve">Mots de passe hachés en BCrypt (coût 12). Jetons d'accès stockés sous forme de hachage SHA-256 uniquement — un dump de base ne permet pas de rejouer une session. Autorisations vérifiées côté serveur pour chaque action, aussi bien sur l'API REST que sur les vues JSF.</w:t>
+        <w:t xml:space="preserve">Mots de passe hachés en BCrypt (coût 12), avec une règle de robustesse (10 caractères minimum, lettre et chiffre, ni mot de passe courant ni adresse e-mail). Le mot de passe d'installation et tout mot de passe fixé par l'admin sont provisoires : l'application impose de les changer à la connexion. Jetons d'accès stockés sous forme de hachage SHA-256 uniquement, à durée de vie limitée. Comptes désactivés, jamais supprimés : connexion refusée, sessions et jetons coupés immédiatement, historique conservé. En-têtes de sécurité sur toutes les réponses (anti-clickjacking, politique de contenu, HSTS en HTTPS) ; cookie de session HttpOnly, SameSite et Secure en HTTPS ; HTTPS imposé par une variable d'environnement en production. Identifiants de la base lus dans l'environnement, jamais dans le code. Autorisations vérifiées côté serveur pour chaque action, aussi bien sur l'API REST que sur les vues JSF.</w:t>
       </w:r>
     </w:p>
     <w:p>
@@ -4754,7 +4931,7 @@
         <w:spacing w:after="160"/>
       </w:pPr>
       <w:r>
-        <w:t xml:space="preserve">Couverture par tests automatisés (JUnit 5) sur les règles métier critiques : hachage de mot de passe, génération et vérification des jetons d'accès, garde de revérification des anomalies, cohérence des compteurs d'activité, matrice des permissions, portée des données par rôle, assainissement des noms de fichiers joints (8 classes de test, 32 tests, tous au vert). Complétée par une vérification de bout en bout dans un navigateur automatisé (Playwright) : droits de chaque rôle et parcours complet d'un testeur — rédaction d'un test, exécution en échec, déclaration de l'anomalie, pièce jointe, rapports — en français et en anglais.</w:t>
+        <w:t xml:space="preserve">Couverture par tests automatisés (JUnit 5) sur les règles métier critiques : hachage de mot de passe, génération et vérification des jetons d'accès, garde de revérification des anomalies, cohérence des compteurs d'activité, matrice des permissions, portée des données par rôle, validation de l'activité par le lead, campagnes figées, rappel quotidien, transitions du cycle de vie des anomalies, assainissement des noms de fichiers joints, recherche et pagination, règle de mot de passe, blocage après échecs de connexion, expiration des jetons (11 classes de test, 45 tests, tous au vert). Complétée par une vérification de bout en bout dans un navigateur automatisé (Playwright) : droits de chaque rôle, parcours complet d'un testeur, déroulé du scénario de démonstration, en français et en anglais.</w:t>
       </w:r>
     </w:p>
     <w:p>
@@ -6303,7 +6480,7 @@
                 <w:sz w:val="19"/>
                 <w:szCs w:val="19"/>
               </w:rPr>
-              <w:t xml:space="preserve">Tests automatisés JUnit (32 tests)</w:t>
+              <w:t xml:space="preserve">Tests automatisés JUnit (45 tests)</w:t>
             </w:r>
           </w:p>
         </w:tc>
@@ -6653,6 +6830,470 @@
                 <w:szCs w:val="19"/>
               </w:rPr>
               <w:t xml:space="preserve">Interface bilingue français / anglais</w:t>
+            </w:r>
+          </w:p>
+        </w:tc>
+        <w:tc>
+          <w:tcPr>
+            <w:tcW w:w="2000" w:type="dxa"/>
+            <w:tcBorders>
+              <w:top w:val="single" w:sz="4" w:space="0" w:color="D8DCE3"/>
+              <w:left w:val="single" w:sz="4" w:space="0" w:color="D8DCE3"/>
+              <w:bottom w:val="single" w:sz="4" w:space="0" w:color="D8DCE3"/>
+              <w:right w:val="single" w:sz="4" w:space="0" w:color="D8DCE3"/>
+            </w:tcBorders>
+            <w:tcMar>
+              <w:top w:w="90" w:type="dxa"/>
+              <w:left w:w="120" w:type="dxa"/>
+              <w:bottom w:w="90" w:type="dxa"/>
+              <w:right w:w="120" w:type="dxa"/>
+            </w:tcMar>
+            <w:vAlign w:val="center"/>
+          </w:tcPr>
+          <w:p>
+            <w:r>
+              <w:rPr>
+                <w:sz w:val="19"/>
+                <w:szCs w:val="19"/>
+              </w:rPr>
+              <w:t xml:space="preserve">Fait</w:t>
+            </w:r>
+          </w:p>
+        </w:tc>
+      </w:tr>
+      <w:tr>
+        <w:tc>
+          <w:tcPr>
+            <w:tcW w:w="7907" w:type="dxa"/>
+            <w:tcBorders>
+              <w:top w:val="single" w:sz="4" w:space="0" w:color="D8DCE3"/>
+              <w:left w:val="single" w:sz="4" w:space="0" w:color="D8DCE3"/>
+              <w:bottom w:val="single" w:sz="4" w:space="0" w:color="D8DCE3"/>
+              <w:right w:val="single" w:sz="4" w:space="0" w:color="D8DCE3"/>
+            </w:tcBorders>
+            <w:tcMar>
+              <w:top w:w="90" w:type="dxa"/>
+              <w:left w:w="120" w:type="dxa"/>
+              <w:bottom w:w="90" w:type="dxa"/>
+              <w:right w:w="120" w:type="dxa"/>
+            </w:tcMar>
+            <w:vAlign w:val="center"/>
+          </w:tcPr>
+          <w:p>
+            <w:r>
+              <w:rPr>
+                <w:b/>
+                <w:bCs/>
+                <w:sz w:val="19"/>
+                <w:szCs w:val="19"/>
+              </w:rPr>
+              <w:t xml:space="preserve">Validation de l'activité par le QA Lead</w:t>
+            </w:r>
+          </w:p>
+        </w:tc>
+        <w:tc>
+          <w:tcPr>
+            <w:tcW w:w="2000" w:type="dxa"/>
+            <w:tcBorders>
+              <w:top w:val="single" w:sz="4" w:space="0" w:color="D8DCE3"/>
+              <w:left w:val="single" w:sz="4" w:space="0" w:color="D8DCE3"/>
+              <w:bottom w:val="single" w:sz="4" w:space="0" w:color="D8DCE3"/>
+              <w:right w:val="single" w:sz="4" w:space="0" w:color="D8DCE3"/>
+            </w:tcBorders>
+            <w:tcMar>
+              <w:top w:w="90" w:type="dxa"/>
+              <w:left w:w="120" w:type="dxa"/>
+              <w:bottom w:w="90" w:type="dxa"/>
+              <w:right w:w="120" w:type="dxa"/>
+            </w:tcMar>
+            <w:vAlign w:val="center"/>
+          </w:tcPr>
+          <w:p>
+            <w:r>
+              <w:rPr>
+                <w:sz w:val="19"/>
+                <w:szCs w:val="19"/>
+              </w:rPr>
+              <w:t xml:space="preserve">Fait</w:t>
+            </w:r>
+          </w:p>
+        </w:tc>
+      </w:tr>
+      <w:tr>
+        <w:tc>
+          <w:tcPr>
+            <w:tcW w:w="7907" w:type="dxa"/>
+            <w:tcBorders>
+              <w:top w:val="single" w:sz="4" w:space="0" w:color="D8DCE3"/>
+              <w:left w:val="single" w:sz="4" w:space="0" w:color="D8DCE3"/>
+              <w:bottom w:val="single" w:sz="4" w:space="0" w:color="D8DCE3"/>
+              <w:right w:val="single" w:sz="4" w:space="0" w:color="D8DCE3"/>
+            </w:tcBorders>
+            <w:tcMar>
+              <w:top w:w="90" w:type="dxa"/>
+              <w:left w:w="120" w:type="dxa"/>
+              <w:bottom w:w="90" w:type="dxa"/>
+              <w:right w:w="120" w:type="dxa"/>
+            </w:tcMar>
+            <w:vAlign w:val="center"/>
+          </w:tcPr>
+          <w:p>
+            <w:r>
+              <w:rPr>
+                <w:b/>
+                <w:bCs/>
+                <w:sz w:val="19"/>
+                <w:szCs w:val="19"/>
+              </w:rPr>
+              <w:t xml:space="preserve">Rappel quotidien de saisie (timer EJB)</w:t>
+            </w:r>
+          </w:p>
+        </w:tc>
+        <w:tc>
+          <w:tcPr>
+            <w:tcW w:w="2000" w:type="dxa"/>
+            <w:tcBorders>
+              <w:top w:val="single" w:sz="4" w:space="0" w:color="D8DCE3"/>
+              <w:left w:val="single" w:sz="4" w:space="0" w:color="D8DCE3"/>
+              <w:bottom w:val="single" w:sz="4" w:space="0" w:color="D8DCE3"/>
+              <w:right w:val="single" w:sz="4" w:space="0" w:color="D8DCE3"/>
+            </w:tcBorders>
+            <w:tcMar>
+              <w:top w:w="90" w:type="dxa"/>
+              <w:left w:w="120" w:type="dxa"/>
+              <w:bottom w:w="90" w:type="dxa"/>
+              <w:right w:w="120" w:type="dxa"/>
+            </w:tcMar>
+            <w:vAlign w:val="center"/>
+          </w:tcPr>
+          <w:p>
+            <w:r>
+              <w:rPr>
+                <w:sz w:val="19"/>
+                <w:szCs w:val="19"/>
+              </w:rPr>
+              <w:t xml:space="preserve">Fait</w:t>
+            </w:r>
+          </w:p>
+        </w:tc>
+      </w:tr>
+      <w:tr>
+        <w:tc>
+          <w:tcPr>
+            <w:tcW w:w="7907" w:type="dxa"/>
+            <w:tcBorders>
+              <w:top w:val="single" w:sz="4" w:space="0" w:color="D8DCE3"/>
+              <w:left w:val="single" w:sz="4" w:space="0" w:color="D8DCE3"/>
+              <w:bottom w:val="single" w:sz="4" w:space="0" w:color="D8DCE3"/>
+              <w:right w:val="single" w:sz="4" w:space="0" w:color="D8DCE3"/>
+            </w:tcBorders>
+            <w:tcMar>
+              <w:top w:w="90" w:type="dxa"/>
+              <w:left w:w="120" w:type="dxa"/>
+              <w:bottom w:w="90" w:type="dxa"/>
+              <w:right w:w="120" w:type="dxa"/>
+            </w:tcMar>
+            <w:vAlign w:val="center"/>
+          </w:tcPr>
+          <w:p>
+            <w:r>
+              <w:rPr>
+                <w:b/>
+                <w:bCs/>
+                <w:sz w:val="19"/>
+                <w:szCs w:val="19"/>
+              </w:rPr>
+              <w:t xml:space="preserve">Cycle de vie complet des anomalies (en cours, à revérifier, fermeture motivée)</w:t>
+            </w:r>
+          </w:p>
+        </w:tc>
+        <w:tc>
+          <w:tcPr>
+            <w:tcW w:w="2000" w:type="dxa"/>
+            <w:tcBorders>
+              <w:top w:val="single" w:sz="4" w:space="0" w:color="D8DCE3"/>
+              <w:left w:val="single" w:sz="4" w:space="0" w:color="D8DCE3"/>
+              <w:bottom w:val="single" w:sz="4" w:space="0" w:color="D8DCE3"/>
+              <w:right w:val="single" w:sz="4" w:space="0" w:color="D8DCE3"/>
+            </w:tcBorders>
+            <w:tcMar>
+              <w:top w:w="90" w:type="dxa"/>
+              <w:left w:w="120" w:type="dxa"/>
+              <w:bottom w:w="90" w:type="dxa"/>
+              <w:right w:w="120" w:type="dxa"/>
+            </w:tcMar>
+            <w:vAlign w:val="center"/>
+          </w:tcPr>
+          <w:p>
+            <w:r>
+              <w:rPr>
+                <w:sz w:val="19"/>
+                <w:szCs w:val="19"/>
+              </w:rPr>
+              <w:t xml:space="preserve">Fait</w:t>
+            </w:r>
+          </w:p>
+        </w:tc>
+      </w:tr>
+      <w:tr>
+        <w:tc>
+          <w:tcPr>
+            <w:tcW w:w="7907" w:type="dxa"/>
+            <w:tcBorders>
+              <w:top w:val="single" w:sz="4" w:space="0" w:color="D8DCE3"/>
+              <w:left w:val="single" w:sz="4" w:space="0" w:color="D8DCE3"/>
+              <w:bottom w:val="single" w:sz="4" w:space="0" w:color="D8DCE3"/>
+              <w:right w:val="single" w:sz="4" w:space="0" w:color="D8DCE3"/>
+            </w:tcBorders>
+            <w:tcMar>
+              <w:top w:w="90" w:type="dxa"/>
+              <w:left w:w="120" w:type="dxa"/>
+              <w:bottom w:w="90" w:type="dxa"/>
+              <w:right w:w="120" w:type="dxa"/>
+            </w:tcMar>
+            <w:vAlign w:val="center"/>
+          </w:tcPr>
+          <w:p>
+            <w:r>
+              <w:rPr>
+                <w:b/>
+                <w:bCs/>
+                <w:sz w:val="19"/>
+                <w:szCs w:val="19"/>
+              </w:rPr>
+              <w:t xml:space="preserve">Campagnes figées hors exécution ; assignation limitée à l'équipe</w:t>
+            </w:r>
+          </w:p>
+        </w:tc>
+        <w:tc>
+          <w:tcPr>
+            <w:tcW w:w="2000" w:type="dxa"/>
+            <w:tcBorders>
+              <w:top w:val="single" w:sz="4" w:space="0" w:color="D8DCE3"/>
+              <w:left w:val="single" w:sz="4" w:space="0" w:color="D8DCE3"/>
+              <w:bottom w:val="single" w:sz="4" w:space="0" w:color="D8DCE3"/>
+              <w:right w:val="single" w:sz="4" w:space="0" w:color="D8DCE3"/>
+            </w:tcBorders>
+            <w:tcMar>
+              <w:top w:w="90" w:type="dxa"/>
+              <w:left w:w="120" w:type="dxa"/>
+              <w:bottom w:w="90" w:type="dxa"/>
+              <w:right w:w="120" w:type="dxa"/>
+            </w:tcMar>
+            <w:vAlign w:val="center"/>
+          </w:tcPr>
+          <w:p>
+            <w:r>
+              <w:rPr>
+                <w:sz w:val="19"/>
+                <w:szCs w:val="19"/>
+              </w:rPr>
+              <w:t xml:space="preserve">Fait</w:t>
+            </w:r>
+          </w:p>
+        </w:tc>
+      </w:tr>
+      <w:tr>
+        <w:tc>
+          <w:tcPr>
+            <w:tcW w:w="7907" w:type="dxa"/>
+            <w:tcBorders>
+              <w:top w:val="single" w:sz="4" w:space="0" w:color="D8DCE3"/>
+              <w:left w:val="single" w:sz="4" w:space="0" w:color="D8DCE3"/>
+              <w:bottom w:val="single" w:sz="4" w:space="0" w:color="D8DCE3"/>
+              <w:right w:val="single" w:sz="4" w:space="0" w:color="D8DCE3"/>
+            </w:tcBorders>
+            <w:tcMar>
+              <w:top w:w="90" w:type="dxa"/>
+              <w:left w:w="120" w:type="dxa"/>
+              <w:bottom w:w="90" w:type="dxa"/>
+              <w:right w:w="120" w:type="dxa"/>
+            </w:tcMar>
+            <w:vAlign w:val="center"/>
+          </w:tcPr>
+          <w:p>
+            <w:r>
+              <w:rPr>
+                <w:b/>
+                <w:bCs/>
+                <w:sz w:val="19"/>
+                <w:szCs w:val="19"/>
+              </w:rPr>
+              <w:t xml:space="preserve">Recherche et pagination des listes</w:t>
+            </w:r>
+          </w:p>
+        </w:tc>
+        <w:tc>
+          <w:tcPr>
+            <w:tcW w:w="2000" w:type="dxa"/>
+            <w:tcBorders>
+              <w:top w:val="single" w:sz="4" w:space="0" w:color="D8DCE3"/>
+              <w:left w:val="single" w:sz="4" w:space="0" w:color="D8DCE3"/>
+              <w:bottom w:val="single" w:sz="4" w:space="0" w:color="D8DCE3"/>
+              <w:right w:val="single" w:sz="4" w:space="0" w:color="D8DCE3"/>
+            </w:tcBorders>
+            <w:tcMar>
+              <w:top w:w="90" w:type="dxa"/>
+              <w:left w:w="120" w:type="dxa"/>
+              <w:bottom w:w="90" w:type="dxa"/>
+              <w:right w:w="120" w:type="dxa"/>
+            </w:tcMar>
+            <w:vAlign w:val="center"/>
+          </w:tcPr>
+          <w:p>
+            <w:r>
+              <w:rPr>
+                <w:sz w:val="19"/>
+                <w:szCs w:val="19"/>
+              </w:rPr>
+              <w:t xml:space="preserve">Fait</w:t>
+            </w:r>
+          </w:p>
+        </w:tc>
+      </w:tr>
+      <w:tr>
+        <w:tc>
+          <w:tcPr>
+            <w:tcW w:w="7907" w:type="dxa"/>
+            <w:tcBorders>
+              <w:top w:val="single" w:sz="4" w:space="0" w:color="D8DCE3"/>
+              <w:left w:val="single" w:sz="4" w:space="0" w:color="D8DCE3"/>
+              <w:bottom w:val="single" w:sz="4" w:space="0" w:color="D8DCE3"/>
+              <w:right w:val="single" w:sz="4" w:space="0" w:color="D8DCE3"/>
+            </w:tcBorders>
+            <w:tcMar>
+              <w:top w:w="90" w:type="dxa"/>
+              <w:left w:w="120" w:type="dxa"/>
+              <w:bottom w:w="90" w:type="dxa"/>
+              <w:right w:w="120" w:type="dxa"/>
+            </w:tcMar>
+            <w:vAlign w:val="center"/>
+          </w:tcPr>
+          <w:p>
+            <w:r>
+              <w:rPr>
+                <w:b/>
+                <w:bCs/>
+                <w:sz w:val="19"/>
+                <w:szCs w:val="19"/>
+              </w:rPr>
+              <w:t xml:space="preserve">Jeu de données et scénario de démonstration</w:t>
+            </w:r>
+          </w:p>
+        </w:tc>
+        <w:tc>
+          <w:tcPr>
+            <w:tcW w:w="2000" w:type="dxa"/>
+            <w:tcBorders>
+              <w:top w:val="single" w:sz="4" w:space="0" w:color="D8DCE3"/>
+              <w:left w:val="single" w:sz="4" w:space="0" w:color="D8DCE3"/>
+              <w:bottom w:val="single" w:sz="4" w:space="0" w:color="D8DCE3"/>
+              <w:right w:val="single" w:sz="4" w:space="0" w:color="D8DCE3"/>
+            </w:tcBorders>
+            <w:tcMar>
+              <w:top w:w="90" w:type="dxa"/>
+              <w:left w:w="120" w:type="dxa"/>
+              <w:bottom w:w="90" w:type="dxa"/>
+              <w:right w:w="120" w:type="dxa"/>
+            </w:tcMar>
+            <w:vAlign w:val="center"/>
+          </w:tcPr>
+          <w:p>
+            <w:r>
+              <w:rPr>
+                <w:sz w:val="19"/>
+                <w:szCs w:val="19"/>
+              </w:rPr>
+              <w:t xml:space="preserve">Fait</w:t>
+            </w:r>
+          </w:p>
+        </w:tc>
+      </w:tr>
+      <w:tr>
+        <w:tc>
+          <w:tcPr>
+            <w:tcW w:w="7907" w:type="dxa"/>
+            <w:tcBorders>
+              <w:top w:val="single" w:sz="4" w:space="0" w:color="D8DCE3"/>
+              <w:left w:val="single" w:sz="4" w:space="0" w:color="D8DCE3"/>
+              <w:bottom w:val="single" w:sz="4" w:space="0" w:color="D8DCE3"/>
+              <w:right w:val="single" w:sz="4" w:space="0" w:color="D8DCE3"/>
+            </w:tcBorders>
+            <w:tcMar>
+              <w:top w:w="90" w:type="dxa"/>
+              <w:left w:w="120" w:type="dxa"/>
+              <w:bottom w:w="90" w:type="dxa"/>
+              <w:right w:w="120" w:type="dxa"/>
+            </w:tcMar>
+            <w:vAlign w:val="center"/>
+          </w:tcPr>
+          <w:p>
+            <w:r>
+              <w:rPr>
+                <w:b/>
+                <w:bCs/>
+                <w:sz w:val="19"/>
+                <w:szCs w:val="19"/>
+              </w:rPr>
+              <w:t xml:space="preserve">Durcissement de la sécurité (mots de passe, connexion, sessions, jetons, HTTPS, en-têtes)</w:t>
+            </w:r>
+          </w:p>
+        </w:tc>
+        <w:tc>
+          <w:tcPr>
+            <w:tcW w:w="2000" w:type="dxa"/>
+            <w:tcBorders>
+              <w:top w:val="single" w:sz="4" w:space="0" w:color="D8DCE3"/>
+              <w:left w:val="single" w:sz="4" w:space="0" w:color="D8DCE3"/>
+              <w:bottom w:val="single" w:sz="4" w:space="0" w:color="D8DCE3"/>
+              <w:right w:val="single" w:sz="4" w:space="0" w:color="D8DCE3"/>
+            </w:tcBorders>
+            <w:tcMar>
+              <w:top w:w="90" w:type="dxa"/>
+              <w:left w:w="120" w:type="dxa"/>
+              <w:bottom w:w="90" w:type="dxa"/>
+              <w:right w:w="120" w:type="dxa"/>
+            </w:tcMar>
+            <w:vAlign w:val="center"/>
+          </w:tcPr>
+          <w:p>
+            <w:r>
+              <w:rPr>
+                <w:sz w:val="19"/>
+                <w:szCs w:val="19"/>
+              </w:rPr>
+              <w:t xml:space="preserve">Fait</w:t>
+            </w:r>
+          </w:p>
+        </w:tc>
+      </w:tr>
+      <w:tr>
+        <w:tc>
+          <w:tcPr>
+            <w:tcW w:w="7907" w:type="dxa"/>
+            <w:tcBorders>
+              <w:top w:val="single" w:sz="4" w:space="0" w:color="D8DCE3"/>
+              <w:left w:val="single" w:sz="4" w:space="0" w:color="D8DCE3"/>
+              <w:bottom w:val="single" w:sz="4" w:space="0" w:color="D8DCE3"/>
+              <w:right w:val="single" w:sz="4" w:space="0" w:color="D8DCE3"/>
+            </w:tcBorders>
+            <w:tcMar>
+              <w:top w:w="90" w:type="dxa"/>
+              <w:left w:w="120" w:type="dxa"/>
+              <w:bottom w:w="90" w:type="dxa"/>
+              <w:right w:w="120" w:type="dxa"/>
+            </w:tcMar>
+            <w:vAlign w:val="center"/>
+          </w:tcPr>
+          <w:p>
+            <w:r>
+              <w:rPr>
+                <w:b/>
+                <w:bCs/>
+                <w:sz w:val="19"/>
+                <w:szCs w:val="19"/>
+              </w:rPr>
+              <w:t xml:space="preserve">Sauvegarde automatique de la base et des pièces jointes</w:t>
             </w:r>
           </w:p>
         </w:tc>
@@ -6769,7 +7410,7 @@
         <w:spacing w:after="160"/>
       </w:pPr>
       <w:r>
-        <w:t xml:space="preserve">Le périmètre fonctionnel défini au chapitre 2 est couvert. Les pistes suivantes — dont les limites connues relevées lors de la revue métier de la V2.1 — restent pertinentes pour une suite éventuelle du projet :</w:t>
+        <w:t xml:space="preserve">Le périmètre fonctionnel défini au chapitre 2 est couvert, et les limites relevées par la revue métier de la V2.1 ont été corrigées en V2.2. Les pistes suivantes restent pertinentes pour une suite éventuelle du projet :</w:t>
       </w:r>
     </w:p>
     <w:p>
@@ -6847,7 +7488,7 @@
         <w:spacing w:after="100"/>
       </w:pPr>
       <w:r>
-        <w:t xml:space="preserve">Validation par le QA Lead des déclarations d'activité de son équipe (aujourd'hui : consultation seulement, via le rapport par testeur).</w:t>
+        <w:t xml:space="preserve">Rappel quotidien également envoyé par e-mail (aujourd'hui : notification dans l'application).</w:t>
       </w:r>
     </w:p>
     <w:p>
@@ -6860,7 +7501,7 @@
         <w:spacing w:after="100"/>
       </w:pPr>
       <w:r>
-        <w:t xml:space="preserve">Envoi effectif du rappel quotidien de saisie : la préférence existe dans les paramètres utilisateur, mais aucun traitement planifié ne l'envoie encore.</w:t>
+        <w:t xml:space="preserve">Pagination en base (requêtes JPQL paginées) au-delà de quelques milliers de lignes par liste ; aujourd'hui, la recherche et la pagination filtrent la liste déjà limitée au périmètre du rôle.</w:t>
       </w:r>
     </w:p>
     <w:p>
@@ -6873,7 +7514,7 @@
         <w:spacing w:after="100"/>
       </w:pPr>
       <w:r>
-        <w:t xml:space="preserve">Statuts d'anomalie « en cours » et « à revérifier » : prévus dans le modèle, pas encore proposés par l'interface (cycle effectif : ouverte → corrigée → fermée ou rouverte).</w:t>
+        <w:t xml:space="preserve">Migrations de schéma versionnées (Flyway ou Liquibase) à la place de la mise à jour automatique par Hibernate, pour les mises à jour en production.</w:t>
       </w:r>
     </w:p>
     <w:p>
@@ -6886,33 +7527,7 @@
         <w:spacing w:after="100"/>
       </w:pPr>
       <w:r>
-        <w:t xml:space="preserve">Figer une campagne terminée : l'exécution d'un test rattaché à une campagne terminée n'est pas encore bloquée.</w:t>
-      </w:r>
-    </w:p>
-    <w:p>
-      <w:pPr>
-        <w:pStyle w:val="Paragraphedeliste"/>
-        <w:numPr>
-          <w:ilvl w:val="0"/>
-          <w:numId w:val="3"/>
-        </w:numPr>
-        <w:spacing w:after="100"/>
-      </w:pPr>
-      <w:r>
-        <w:t xml:space="preserve">Limiter l'assignation d'une anomalie aux membres de l'équipe du projet.</w:t>
-      </w:r>
-    </w:p>
-    <w:p>
-      <w:pPr>
-        <w:pStyle w:val="Paragraphedeliste"/>
-        <w:numPr>
-          <w:ilvl w:val="0"/>
-          <w:numId w:val="3"/>
-        </w:numPr>
-        <w:spacing w:after="100"/>
-      </w:pPr>
-      <w:r>
-        <w:t xml:space="preserve">Pagination et recherche dans les listes, pour les gros volumes.</w:t>
+        <w:t xml:space="preserve">Connexion avec les comptes de l'entreprise (SSO : Active Directory, Microsoft, Google).</w:t>
       </w:r>
     </w:p>
     <w:p>
@@ -7001,7 +7616,7 @@
           <w:szCs w:val="20"/>
           <w:lang w:val="en-US"/>
         </w:rPr>
-        <w:t xml:space="preserve">open  →  fixed  →  closed (revérification réussie) ou reopened (revérification échouée) — in_progress et retest : réservés à une évolution (chapitre 10)</w:t>
+        <w:t xml:space="preserve">open  →  in_progress  →  fixed  →  retest  →  closed (revérification réussie) ou reopened (revérification échouée) — fermeture directe possible avec un motif</w:t>
       </w:r>
     </w:p>
     <w:p>
@@ -7031,7 +7646,7 @@
           <w:sz w:val="20"/>
           <w:szCs w:val="20"/>
         </w:rPr>
-        <w:t xml:space="preserve">planned  →  in_progress  →  completed (ou blocked)</w:t>
+        <w:t xml:space="preserve">planned  →  in_progress  →  completed (ou blocked) — les tests ne s'exécutent qu'en in_progress</w:t>
       </w:r>
     </w:p>
     <w:p>
@@ -7097,7 +7712,7 @@
         <w:sz w:val="15"/>
         <w:szCs w:val="15"/>
       </w:rPr>
-      <w:t>Mame Codou Diouf — 24 septembre 2026</w:t>
+      <w:t>Mame Codou Diouf — 25 septembre 2026</w:t>
     </w:r>
     <w:r>
       <w:rPr>

</xml_diff>

<commit_message>
mot de passe oublié, migrations Flyway...
</commit_message>
<xml_diff>
--- a/docs/Cahier-des-charges-QA-Reporting-J2EE-NOUVEAU.docx
+++ b/docs/Cahier-des-charges-QA-Reporting-J2EE-NOUVEAU.docx
@@ -185,7 +185,7 @@
                 <w:sz w:val="19"/>
                 <w:szCs w:val="19"/>
               </w:rPr>
-              <w:t xml:space="preserve">25 septembre 2026</w:t>
+              <w:t xml:space="preserve">27 septembre 2026</w:t>
             </w:r>
           </w:p>
         </w:tc>
@@ -397,7 +397,7 @@
         <w:spacing w:after="160"/>
       </w:pPr>
       <w:r>
-        <w:t xml:space="preserve">Cette version du document (V2.3, 25 septembre 2026) ajoute le durcissement de la sécurité : règle de mot de passe, mot de passe provisoire à changer, blocage après échecs de connexion, renouvellement de la session, expiration des jetons d'API, désactivation des comptes au lieu de leur suppression, en-têtes de sécurité, HTTPS activable, identifiants de base hors du code et sauvegarde automatique. La V2.2 (24 septembre 2026) remplaçait la V2.1 du même jour, qui remplaçait la V2.0 du 21 septembre 2026. La V2.1 a apporté la vérification des droits et de la portée des données dans l'interface JSF, le journal d'audit, les pièces jointes et la déclaration d'anomalie depuis un test en échec, les rapports par période, la rédaction de cas de test par les QA et l'interface bilingue. La V2.2 corrige les écarts relevés par la revue métier de la V2.1 : validation de l'activité par le QA Lead, rappel quotidien effectif, cycle de vie complet des anomalies, campagnes figées hors exécution, assignation limitée à l'équipe ; elle ajoute la recherche et la pagination des listes et un jeu de données de démonstration.</w:t>
+        <w:t xml:space="preserve">Cette version du document (V2.4, 27 septembre 2026) permet d'affecter un testeur à plusieurs projets, protège contre les modifications simultanées, pagine les listes en base, ajoute la réinitialisation du mot de passe par e-mail et confie l'évolution du schéma à des migrations Flyway versionnées. La V2.3 (25 septembre 2026) ajoutait le durcissement de la sécurité : règle de mot de passe, mot de passe provisoire à changer, blocage après échecs de connexion, renouvellement de la session, expiration des jetons d'API, désactivation des comptes au lieu de leur suppression, en-têtes de sécurité, HTTPS activable, identifiants de base hors du code et sauvegarde automatique. La V2.2 (24 septembre 2026) remplaçait la V2.1 du même jour, qui remplaçait la V2.0 du 21 septembre 2026. La V2.1 a apporté la vérification des droits et de la portée des données dans l'interface JSF, le journal d'audit, les pièces jointes et la déclaration d'anomalie depuis un test en échec, les rapports par période, la rédaction de cas de test par les QA et l'interface bilingue. La V2.2 corrige les écarts relevés par la revue métier de la V2.1 : validation de l'activité par le QA Lead, rappel quotidien effectif, cycle de vie complet des anomalies, campagnes figées hors exécution, assignation limitée à l'équipe ; elle ajoute la recherche et la pagination des listes et un jeu de données de démonstration.</w:t>
       </w:r>
     </w:p>
     <w:p>
@@ -696,6 +696,32 @@
     </w:p>
     <w:p>
       <w:pPr>
+        <w:pStyle w:val="Paragraphedeliste"/>
+        <w:numPr>
+          <w:ilvl w:val="0"/>
+          <w:numId w:val="2"/>
+        </w:numPr>
+        <w:spacing w:after="80"/>
+      </w:pPr>
+      <w:r>
+        <w:t xml:space="preserve">Réinitialisation du mot de passe par e-mail (lien à usage unique)</w:t>
+      </w:r>
+    </w:p>
+    <w:p>
+      <w:pPr>
+        <w:pStyle w:val="Paragraphedeliste"/>
+        <w:numPr>
+          <w:ilvl w:val="0"/>
+          <w:numId w:val="2"/>
+        </w:numPr>
+        <w:spacing w:after="80"/>
+      </w:pPr>
+      <w:r>
+        <w:t xml:space="preserve">Affectation d'un testeur à plusieurs projets, y compris ceux d'autres équipes</w:t>
+      </w:r>
+    </w:p>
+    <w:p>
+      <w:pPr>
         <w:pStyle w:val="Titre3"/>
         <w:spacing w:before="200" w:after="100"/>
       </w:pPr>
@@ -746,7 +772,7 @@
         <w:spacing w:after="80"/>
       </w:pPr>
       <w:r>
-        <w:t xml:space="preserve">Envoi réel d'emails (mot de passe oublié)</w:t>
+        <w:t xml:space="preserve">Notifications par e-mail des événements métier (seule la réinitialisation du mot de passe envoie un e-mail)</w:t>
       </w:r>
     </w:p>
     <w:p>
@@ -963,7 +989,7 @@
                 <w:sz w:val="19"/>
                 <w:szCs w:val="19"/>
               </w:rPr>
-              <w:t>Ses propres tests, activités et anomalies</w:t>
+              <w:t xml:space="preserve">Ses propres tests, activités et anomalies, sur les projets de son équipe et ceux auxquels il est affecté</w:t>
             </w:r>
           </w:p>
         </w:tc>
@@ -990,7 +1016,7 @@
                 <w:sz w:val="19"/>
                 <w:szCs w:val="19"/>
               </w:rPr>
-              <w:t xml:space="preserve">Rédige et exécute ses cas de test, déclare son activité, crée des anomalies avec pièces jointes</w:t>
+              <w:t xml:space="preserve">Rédige et exécute ses cas de test, déclare son activité, crée des anomalies avec pièces jointes ; peut être affecté à plusieurs projets</w:t>
             </w:r>
           </w:p>
         </w:tc>
@@ -1525,6 +1551,31 @@
     </w:p>
     <w:p>
       <w:pPr>
+        <w:pStyle w:val="Titre2"/>
+        <w:spacing w:before="280" w:after="140"/>
+      </w:pPr>
+      <w:r>
+        <w:rPr>
+          <w:b/>
+          <w:bCs/>
+          <w:color w:val="1F3557"/>
+          <w:sz w:val="24"/>
+          <w:szCs w:val="24"/>
+        </w:rPr>
+        <w:t xml:space="preserve">4.11 Projets et affectations</w:t>
+      </w:r>
+    </w:p>
+    <w:p>
+      <w:pPr>
+        <w:spacing w:after="160"/>
+      </w:pPr>
+      <w:r>
+        <w:lastRenderedPageBreak/>
+        <w:t xml:space="preserve">Un projet appartient à une équipe (celle de son QA Lead) et compte en plus des testeurs affectés, quelle que soit leur équipe : un QA peut ainsi travailler sur plusieurs projets. Le périmètre de chacun devient « les projets de mon équipe et ceux auxquels je suis affecté ». L'activité déclarée sur un projet est validée par le QA Lead de l'équipe du projet ; tests et anomalies ne s'assignent qu'aux testeurs du projet ; les notifications de campagne vont à l'équipe et aux testeurs affectés. Deux personnes qui modifient le même élément en même temps ne s'écrasent plus : la seconde est prévenue et retrouve la version à jour (verrou optimiste). Les listes longues (anomalies, tests, activité) sont recherchées et paginées directement en base. « Mot de passe oublié » envoie un lien valable une heure et utilisable une seule fois, sans révéler si l'adresse existe.</w:t>
+      </w:r>
+    </w:p>
+    <w:p>
+      <w:pPr>
         <w:pStyle w:val="Titre1"/>
         <w:pBdr>
           <w:bottom w:val="single" w:sz="6" w:space="6" w:color="2C4A7C"/>
@@ -1547,7 +1598,7 @@
         <w:spacing w:after="160"/>
       </w:pPr>
       <w:r>
-        <w:t xml:space="preserve">Seize entités JPA (plus une classe abstraite mutualisant les dates de création / modification) structurent l'application — le même schéma relationnel que la version Laravel, porté d'Eloquent vers Jakarta Persistence. Le schéma est généré et tenu à jour automatiquement par Hibernate à partir des entités (hibernate.hbm2ddl.auto=update), l'équivalent J2EE des migrations Laravel.</w:t>
+        <w:t xml:space="preserve">Dix-sept entités JPA (plus une classe abstraite mutualisant les dates de création / modification) structurent l'application. Le schéma est créé puis modifié par des migrations Flyway versionnées (src/main/resources/db/migration, V1 = schéma initial) appliquées au démarrage ; Hibernate ne le modifie plus lui-même et vérifie seulement qu'il correspond aux entités — une entité modifiée sans migration empêche le démarrage avec un message explicite. Les entités principales portent un numéro de version (verrou optimiste).</w:t>
       </w:r>
     </w:p>
     <w:tbl>
@@ -1706,24 +1757,23 @@
               <w:bottom w:val="single" w:sz="4" w:space="0" w:color="D8DCE3"/>
               <w:right w:val="single" w:sz="4" w:space="0" w:color="D8DCE3"/>
             </w:tcBorders>
-            <w:shd w:val="clear" w:color="auto" w:fill="F7F8FA"/>
-            <w:tcMar>
-              <w:top w:w="90" w:type="dxa"/>
-              <w:left w:w="120" w:type="dxa"/>
-              <w:bottom w:w="90" w:type="dxa"/>
-              <w:right w:w="120" w:type="dxa"/>
-            </w:tcMar>
-            <w:vAlign w:val="center"/>
-          </w:tcPr>
-          <w:p>
-            <w:r>
-              <w:rPr>
-                <w:b/>
-                <w:bCs/>
-                <w:sz w:val="19"/>
-                <w:szCs w:val="19"/>
-              </w:rPr>
-              <w:t xml:space="preserve">Team / Environment</w:t>
+            <w:tcMar>
+              <w:top w:w="90" w:type="dxa"/>
+              <w:left w:w="120" w:type="dxa"/>
+              <w:bottom w:w="90" w:type="dxa"/>
+              <w:right w:w="120" w:type="dxa"/>
+            </w:tcMar>
+            <w:vAlign w:val="center"/>
+          </w:tcPr>
+          <w:p>
+            <w:r>
+              <w:rPr>
+                <w:b/>
+                <w:bCs/>
+                <w:sz w:val="19"/>
+                <w:szCs w:val="19"/>
+              </w:rPr>
+              <w:t xml:space="preserve">PasswordResetToken</w:t>
             </w:r>
           </w:p>
         </w:tc>
@@ -1736,22 +1786,21 @@
               <w:bottom w:val="single" w:sz="4" w:space="0" w:color="D8DCE3"/>
               <w:right w:val="single" w:sz="4" w:space="0" w:color="D8DCE3"/>
             </w:tcBorders>
-            <w:shd w:val="clear" w:color="auto" w:fill="F7F8FA"/>
-            <w:tcMar>
-              <w:top w:w="90" w:type="dxa"/>
-              <w:left w:w="120" w:type="dxa"/>
-              <w:bottom w:w="90" w:type="dxa"/>
-              <w:right w:w="120" w:type="dxa"/>
-            </w:tcMar>
-            <w:vAlign w:val="center"/>
-          </w:tcPr>
-          <w:p>
-            <w:r>
-              <w:rPr>
-                <w:sz w:val="19"/>
-                <w:szCs w:val="19"/>
-              </w:rPr>
-              <w:t>Organisation des équipes et des environnements techniques</w:t>
+            <w:tcMar>
+              <w:top w:w="90" w:type="dxa"/>
+              <w:left w:w="120" w:type="dxa"/>
+              <w:bottom w:w="90" w:type="dxa"/>
+              <w:right w:w="120" w:type="dxa"/>
+            </w:tcMar>
+            <w:vAlign w:val="center"/>
+          </w:tcPr>
+          <w:p>
+            <w:r>
+              <w:rPr>
+                <w:sz w:val="19"/>
+                <w:szCs w:val="19"/>
+              </w:rPr>
+              <w:t xml:space="preserve">Liens de réinitialisation du mot de passe (hachage uniquement, 1 h, usage unique)</w:t>
             </w:r>
           </w:p>
         </w:tc>
@@ -1766,23 +1815,24 @@
               <w:bottom w:val="single" w:sz="4" w:space="0" w:color="D8DCE3"/>
               <w:right w:val="single" w:sz="4" w:space="0" w:color="D8DCE3"/>
             </w:tcBorders>
-            <w:tcMar>
-              <w:top w:w="90" w:type="dxa"/>
-              <w:left w:w="120" w:type="dxa"/>
-              <w:bottom w:w="90" w:type="dxa"/>
-              <w:right w:w="120" w:type="dxa"/>
-            </w:tcMar>
-            <w:vAlign w:val="center"/>
-          </w:tcPr>
-          <w:p>
-            <w:r>
-              <w:rPr>
-                <w:b/>
-                <w:bCs/>
-                <w:sz w:val="19"/>
-                <w:szCs w:val="19"/>
-              </w:rPr>
-              <w:t>Project</w:t>
+            <w:shd w:val="clear" w:color="auto" w:fill="F7F8FA"/>
+            <w:tcMar>
+              <w:top w:w="90" w:type="dxa"/>
+              <w:left w:w="120" w:type="dxa"/>
+              <w:bottom w:w="90" w:type="dxa"/>
+              <w:right w:w="120" w:type="dxa"/>
+            </w:tcMar>
+            <w:vAlign w:val="center"/>
+          </w:tcPr>
+          <w:p>
+            <w:r>
+              <w:rPr>
+                <w:b/>
+                <w:bCs/>
+                <w:sz w:val="19"/>
+                <w:szCs w:val="19"/>
+              </w:rPr>
+              <w:t xml:space="preserve">Team / Environment</w:t>
             </w:r>
           </w:p>
         </w:tc>
@@ -1795,21 +1845,22 @@
               <w:bottom w:val="single" w:sz="4" w:space="0" w:color="D8DCE3"/>
               <w:right w:val="single" w:sz="4" w:space="0" w:color="D8DCE3"/>
             </w:tcBorders>
-            <w:tcMar>
-              <w:top w:w="90" w:type="dxa"/>
-              <w:left w:w="120" w:type="dxa"/>
-              <w:bottom w:w="90" w:type="dxa"/>
-              <w:right w:w="120" w:type="dxa"/>
-            </w:tcMar>
-            <w:vAlign w:val="center"/>
-          </w:tcPr>
-          <w:p>
-            <w:r>
-              <w:rPr>
-                <w:sz w:val="19"/>
-                <w:szCs w:val="19"/>
-              </w:rPr>
-              <w:t>Regroupement de haut niveau du travail QA</w:t>
+            <w:shd w:val="clear" w:color="auto" w:fill="F7F8FA"/>
+            <w:tcMar>
+              <w:top w:w="90" w:type="dxa"/>
+              <w:left w:w="120" w:type="dxa"/>
+              <w:bottom w:w="90" w:type="dxa"/>
+              <w:right w:w="120" w:type="dxa"/>
+            </w:tcMar>
+            <w:vAlign w:val="center"/>
+          </w:tcPr>
+          <w:p>
+            <w:r>
+              <w:rPr>
+                <w:sz w:val="19"/>
+                <w:szCs w:val="19"/>
+              </w:rPr>
+              <w:t>Organisation des équipes et des environnements techniques</w:t>
             </w:r>
           </w:p>
         </w:tc>
@@ -1824,24 +1875,23 @@
               <w:bottom w:val="single" w:sz="4" w:space="0" w:color="D8DCE3"/>
               <w:right w:val="single" w:sz="4" w:space="0" w:color="D8DCE3"/>
             </w:tcBorders>
-            <w:shd w:val="clear" w:color="auto" w:fill="F7F8FA"/>
-            <w:tcMar>
-              <w:top w:w="90" w:type="dxa"/>
-              <w:left w:w="120" w:type="dxa"/>
-              <w:bottom w:w="90" w:type="dxa"/>
-              <w:right w:w="120" w:type="dxa"/>
-            </w:tcMar>
-            <w:vAlign w:val="center"/>
-          </w:tcPr>
-          <w:p>
-            <w:r>
-              <w:rPr>
-                <w:b/>
-                <w:bCs/>
-                <w:sz w:val="19"/>
-                <w:szCs w:val="19"/>
-              </w:rPr>
-              <w:t>Campaign</w:t>
+            <w:tcMar>
+              <w:top w:w="90" w:type="dxa"/>
+              <w:left w:w="120" w:type="dxa"/>
+              <w:bottom w:w="90" w:type="dxa"/>
+              <w:right w:w="120" w:type="dxa"/>
+            </w:tcMar>
+            <w:vAlign w:val="center"/>
+          </w:tcPr>
+          <w:p>
+            <w:r>
+              <w:rPr>
+                <w:b/>
+                <w:bCs/>
+                <w:sz w:val="19"/>
+                <w:szCs w:val="19"/>
+              </w:rPr>
+              <w:t>Project</w:t>
             </w:r>
           </w:p>
         </w:tc>
@@ -1854,22 +1904,21 @@
               <w:bottom w:val="single" w:sz="4" w:space="0" w:color="D8DCE3"/>
               <w:right w:val="single" w:sz="4" w:space="0" w:color="D8DCE3"/>
             </w:tcBorders>
-            <w:shd w:val="clear" w:color="auto" w:fill="F7F8FA"/>
-            <w:tcMar>
-              <w:top w:w="90" w:type="dxa"/>
-              <w:left w:w="120" w:type="dxa"/>
-              <w:bottom w:w="90" w:type="dxa"/>
-              <w:right w:w="120" w:type="dxa"/>
-            </w:tcMar>
-            <w:vAlign w:val="center"/>
-          </w:tcPr>
-          <w:p>
-            <w:r>
-              <w:rPr>
-                <w:sz w:val="19"/>
-                <w:szCs w:val="19"/>
-              </w:rPr>
-              <w:t>Campagnes de test rattachées à un projet</w:t>
+            <w:tcMar>
+              <w:top w:w="90" w:type="dxa"/>
+              <w:left w:w="120" w:type="dxa"/>
+              <w:bottom w:w="90" w:type="dxa"/>
+              <w:right w:w="120" w:type="dxa"/>
+            </w:tcMar>
+            <w:vAlign w:val="center"/>
+          </w:tcPr>
+          <w:p>
+            <w:r>
+              <w:rPr>
+                <w:sz w:val="19"/>
+                <w:szCs w:val="19"/>
+              </w:rPr>
+              <w:t>Regroupement de haut niveau du travail QA</w:t>
             </w:r>
           </w:p>
         </w:tc>
@@ -1884,6 +1933,66 @@
               <w:bottom w:val="single" w:sz="4" w:space="0" w:color="D8DCE3"/>
               <w:right w:val="single" w:sz="4" w:space="0" w:color="D8DCE3"/>
             </w:tcBorders>
+            <w:shd w:val="clear" w:color="auto" w:fill="F7F8FA"/>
+            <w:tcMar>
+              <w:top w:w="90" w:type="dxa"/>
+              <w:left w:w="120" w:type="dxa"/>
+              <w:bottom w:w="90" w:type="dxa"/>
+              <w:right w:w="120" w:type="dxa"/>
+            </w:tcMar>
+            <w:vAlign w:val="center"/>
+          </w:tcPr>
+          <w:p>
+            <w:r>
+              <w:rPr>
+                <w:b/>
+                <w:bCs/>
+                <w:sz w:val="19"/>
+                <w:szCs w:val="19"/>
+              </w:rPr>
+              <w:t>Campaign</w:t>
+            </w:r>
+          </w:p>
+        </w:tc>
+        <w:tc>
+          <w:tcPr>
+            <w:tcW w:w="7307" w:type="dxa"/>
+            <w:tcBorders>
+              <w:top w:val="single" w:sz="4" w:space="0" w:color="D8DCE3"/>
+              <w:left w:val="single" w:sz="4" w:space="0" w:color="D8DCE3"/>
+              <w:bottom w:val="single" w:sz="4" w:space="0" w:color="D8DCE3"/>
+              <w:right w:val="single" w:sz="4" w:space="0" w:color="D8DCE3"/>
+            </w:tcBorders>
+            <w:shd w:val="clear" w:color="auto" w:fill="F7F8FA"/>
+            <w:tcMar>
+              <w:top w:w="90" w:type="dxa"/>
+              <w:left w:w="120" w:type="dxa"/>
+              <w:bottom w:w="90" w:type="dxa"/>
+              <w:right w:w="120" w:type="dxa"/>
+            </w:tcMar>
+            <w:vAlign w:val="center"/>
+          </w:tcPr>
+          <w:p>
+            <w:r>
+              <w:rPr>
+                <w:sz w:val="19"/>
+                <w:szCs w:val="19"/>
+              </w:rPr>
+              <w:t>Campagnes de test rattachées à un projet</w:t>
+            </w:r>
+          </w:p>
+        </w:tc>
+      </w:tr>
+      <w:tr>
+        <w:tc>
+          <w:tcPr>
+            <w:tcW w:w="2600" w:type="dxa"/>
+            <w:tcBorders>
+              <w:top w:val="single" w:sz="4" w:space="0" w:color="D8DCE3"/>
+              <w:left w:val="single" w:sz="4" w:space="0" w:color="D8DCE3"/>
+              <w:bottom w:val="single" w:sz="4" w:space="0" w:color="D8DCE3"/>
+              <w:right w:val="single" w:sz="4" w:space="0" w:color="D8DCE3"/>
+            </w:tcBorders>
             <w:tcMar>
               <w:top w:w="90" w:type="dxa"/>
               <w:left w:w="120" w:type="dxa"/>
@@ -1927,7 +2036,7 @@
                 <w:sz w:val="19"/>
                 <w:szCs w:val="19"/>
               </w:rPr>
-              <w:t>Cas de test rattachés à une campagne</w:t>
+              <w:t xml:space="preserve">Cas de test rattachés à une campagne ; les projets ont leurs testeurs affectés (table project_members)</w:t>
             </w:r>
           </w:p>
         </w:tc>
@@ -4931,7 +5040,7 @@
         <w:spacing w:after="160"/>
       </w:pPr>
       <w:r>
-        <w:t xml:space="preserve">Couverture par tests automatisés (JUnit 5) sur les règles métier critiques : hachage de mot de passe, génération et vérification des jetons d'accès, garde de revérification des anomalies, cohérence des compteurs d'activité, matrice des permissions, portée des données par rôle, validation de l'activité par le lead, campagnes figées, rappel quotidien, transitions du cycle de vie des anomalies, assainissement des noms de fichiers joints, recherche et pagination, règle de mot de passe, blocage après échecs de connexion, expiration des jetons (11 classes de test, 45 tests, tous au vert). Complétée par une vérification de bout en bout dans un navigateur automatisé (Playwright) : droits de chaque rôle, parcours complet d'un testeur, déroulé du scénario de démonstration, en français et en anglais.</w:t>
+        <w:t xml:space="preserve">Couverture par tests automatisés (JUnit 5) sur les règles métier critiques : hachage de mot de passe, génération et vérification des jetons d'accès, garde de revérification des anomalies, cohérence des compteurs d'activité, matrice des permissions, portée des données par rôle, validation de l'activité par le lead, campagnes figées, rappel quotidien, transitions du cycle de vie des anomalies, assainissement des noms de fichiers joints, recherche et pagination, règle de mot de passe, blocage après échecs de connexion, expiration des jetons, affectation multi-projets (11 classes de test, 48 tests, tous au vert). Complétée par une vérification de bout en bout dans un navigateur automatisé (Playwright) : droits de chaque rôle, parcours complet d'un testeur, déroulé du scénario de démonstration, en français et en anglais.</w:t>
       </w:r>
     </w:p>
     <w:p>
@@ -5363,7 +5472,7 @@
                 <w:sz w:val="19"/>
                 <w:szCs w:val="19"/>
               </w:rPr>
-              <w:t>JPA / Hibernate 6, unité de persistance JTA</w:t>
+              <w:t xml:space="preserve">JPA / Hibernate 6, unité de persistance JTA ; schéma versionné par Flyway 9</w:t>
             </w:r>
           </w:p>
         </w:tc>
@@ -6480,7 +6589,7 @@
                 <w:sz w:val="19"/>
                 <w:szCs w:val="19"/>
               </w:rPr>
-              <w:t xml:space="preserve">Tests automatisés JUnit (45 tests)</w:t>
+              <w:t xml:space="preserve">Tests automatisés JUnit (48 tests)</w:t>
             </w:r>
           </w:p>
         </w:tc>
@@ -7294,6 +7403,296 @@
                 <w:szCs w:val="19"/>
               </w:rPr>
               <w:t xml:space="preserve">Sauvegarde automatique de la base et des pièces jointes</w:t>
+            </w:r>
+          </w:p>
+        </w:tc>
+        <w:tc>
+          <w:tcPr>
+            <w:tcW w:w="2000" w:type="dxa"/>
+            <w:tcBorders>
+              <w:top w:val="single" w:sz="4" w:space="0" w:color="D8DCE3"/>
+              <w:left w:val="single" w:sz="4" w:space="0" w:color="D8DCE3"/>
+              <w:bottom w:val="single" w:sz="4" w:space="0" w:color="D8DCE3"/>
+              <w:right w:val="single" w:sz="4" w:space="0" w:color="D8DCE3"/>
+            </w:tcBorders>
+            <w:tcMar>
+              <w:top w:w="90" w:type="dxa"/>
+              <w:left w:w="120" w:type="dxa"/>
+              <w:bottom w:w="90" w:type="dxa"/>
+              <w:right w:w="120" w:type="dxa"/>
+            </w:tcMar>
+            <w:vAlign w:val="center"/>
+          </w:tcPr>
+          <w:p>
+            <w:r>
+              <w:rPr>
+                <w:sz w:val="19"/>
+                <w:szCs w:val="19"/>
+              </w:rPr>
+              <w:t xml:space="preserve">Fait</w:t>
+            </w:r>
+          </w:p>
+        </w:tc>
+      </w:tr>
+      <w:tr>
+        <w:tc>
+          <w:tcPr>
+            <w:tcW w:w="7907" w:type="dxa"/>
+            <w:tcBorders>
+              <w:top w:val="single" w:sz="4" w:space="0" w:color="D8DCE3"/>
+              <w:left w:val="single" w:sz="4" w:space="0" w:color="D8DCE3"/>
+              <w:bottom w:val="single" w:sz="4" w:space="0" w:color="D8DCE3"/>
+              <w:right w:val="single" w:sz="4" w:space="0" w:color="D8DCE3"/>
+            </w:tcBorders>
+            <w:tcMar>
+              <w:top w:w="90" w:type="dxa"/>
+              <w:left w:w="120" w:type="dxa"/>
+              <w:bottom w:w="90" w:type="dxa"/>
+              <w:right w:w="120" w:type="dxa"/>
+            </w:tcMar>
+            <w:vAlign w:val="center"/>
+          </w:tcPr>
+          <w:p>
+            <w:r>
+              <w:rPr>
+                <w:b/>
+                <w:bCs/>
+                <w:sz w:val="19"/>
+                <w:szCs w:val="19"/>
+              </w:rPr>
+              <w:t xml:space="preserve">Testeurs affectés à plusieurs projets</w:t>
+            </w:r>
+          </w:p>
+        </w:tc>
+        <w:tc>
+          <w:tcPr>
+            <w:tcW w:w="2000" w:type="dxa"/>
+            <w:tcBorders>
+              <w:top w:val="single" w:sz="4" w:space="0" w:color="D8DCE3"/>
+              <w:left w:val="single" w:sz="4" w:space="0" w:color="D8DCE3"/>
+              <w:bottom w:val="single" w:sz="4" w:space="0" w:color="D8DCE3"/>
+              <w:right w:val="single" w:sz="4" w:space="0" w:color="D8DCE3"/>
+            </w:tcBorders>
+            <w:tcMar>
+              <w:top w:w="90" w:type="dxa"/>
+              <w:left w:w="120" w:type="dxa"/>
+              <w:bottom w:w="90" w:type="dxa"/>
+              <w:right w:w="120" w:type="dxa"/>
+            </w:tcMar>
+            <w:vAlign w:val="center"/>
+          </w:tcPr>
+          <w:p>
+            <w:r>
+              <w:rPr>
+                <w:sz w:val="19"/>
+                <w:szCs w:val="19"/>
+              </w:rPr>
+              <w:t xml:space="preserve">Fait</w:t>
+            </w:r>
+          </w:p>
+        </w:tc>
+      </w:tr>
+      <w:tr>
+        <w:tc>
+          <w:tcPr>
+            <w:tcW w:w="7907" w:type="dxa"/>
+            <w:tcBorders>
+              <w:top w:val="single" w:sz="4" w:space="0" w:color="D8DCE3"/>
+              <w:left w:val="single" w:sz="4" w:space="0" w:color="D8DCE3"/>
+              <w:bottom w:val="single" w:sz="4" w:space="0" w:color="D8DCE3"/>
+              <w:right w:val="single" w:sz="4" w:space="0" w:color="D8DCE3"/>
+            </w:tcBorders>
+            <w:tcMar>
+              <w:top w:w="90" w:type="dxa"/>
+              <w:left w:w="120" w:type="dxa"/>
+              <w:bottom w:w="90" w:type="dxa"/>
+              <w:right w:w="120" w:type="dxa"/>
+            </w:tcMar>
+            <w:vAlign w:val="center"/>
+          </w:tcPr>
+          <w:p>
+            <w:r>
+              <w:rPr>
+                <w:b/>
+                <w:bCs/>
+                <w:sz w:val="19"/>
+                <w:szCs w:val="19"/>
+              </w:rPr>
+              <w:t xml:space="preserve">Verrou optimiste (modifications simultanées)</w:t>
+            </w:r>
+          </w:p>
+        </w:tc>
+        <w:tc>
+          <w:tcPr>
+            <w:tcW w:w="2000" w:type="dxa"/>
+            <w:tcBorders>
+              <w:top w:val="single" w:sz="4" w:space="0" w:color="D8DCE3"/>
+              <w:left w:val="single" w:sz="4" w:space="0" w:color="D8DCE3"/>
+              <w:bottom w:val="single" w:sz="4" w:space="0" w:color="D8DCE3"/>
+              <w:right w:val="single" w:sz="4" w:space="0" w:color="D8DCE3"/>
+            </w:tcBorders>
+            <w:tcMar>
+              <w:top w:w="90" w:type="dxa"/>
+              <w:left w:w="120" w:type="dxa"/>
+              <w:bottom w:w="90" w:type="dxa"/>
+              <w:right w:w="120" w:type="dxa"/>
+            </w:tcMar>
+            <w:vAlign w:val="center"/>
+          </w:tcPr>
+          <w:p>
+            <w:r>
+              <w:rPr>
+                <w:sz w:val="19"/>
+                <w:szCs w:val="19"/>
+              </w:rPr>
+              <w:t xml:space="preserve">Fait</w:t>
+            </w:r>
+          </w:p>
+        </w:tc>
+      </w:tr>
+      <w:tr>
+        <w:tc>
+          <w:tcPr>
+            <w:tcW w:w="7907" w:type="dxa"/>
+            <w:tcBorders>
+              <w:top w:val="single" w:sz="4" w:space="0" w:color="D8DCE3"/>
+              <w:left w:val="single" w:sz="4" w:space="0" w:color="D8DCE3"/>
+              <w:bottom w:val="single" w:sz="4" w:space="0" w:color="D8DCE3"/>
+              <w:right w:val="single" w:sz="4" w:space="0" w:color="D8DCE3"/>
+            </w:tcBorders>
+            <w:tcMar>
+              <w:top w:w="90" w:type="dxa"/>
+              <w:left w:w="120" w:type="dxa"/>
+              <w:bottom w:w="90" w:type="dxa"/>
+              <w:right w:w="120" w:type="dxa"/>
+            </w:tcMar>
+            <w:vAlign w:val="center"/>
+          </w:tcPr>
+          <w:p>
+            <w:r>
+              <w:rPr>
+                <w:b/>
+                <w:bCs/>
+                <w:sz w:val="19"/>
+                <w:szCs w:val="19"/>
+              </w:rPr>
+              <w:t xml:space="preserve">Pagination en base et indicateurs calculés par la base</w:t>
+            </w:r>
+          </w:p>
+        </w:tc>
+        <w:tc>
+          <w:tcPr>
+            <w:tcW w:w="2000" w:type="dxa"/>
+            <w:tcBorders>
+              <w:top w:val="single" w:sz="4" w:space="0" w:color="D8DCE3"/>
+              <w:left w:val="single" w:sz="4" w:space="0" w:color="D8DCE3"/>
+              <w:bottom w:val="single" w:sz="4" w:space="0" w:color="D8DCE3"/>
+              <w:right w:val="single" w:sz="4" w:space="0" w:color="D8DCE3"/>
+            </w:tcBorders>
+            <w:tcMar>
+              <w:top w:w="90" w:type="dxa"/>
+              <w:left w:w="120" w:type="dxa"/>
+              <w:bottom w:w="90" w:type="dxa"/>
+              <w:right w:w="120" w:type="dxa"/>
+            </w:tcMar>
+            <w:vAlign w:val="center"/>
+          </w:tcPr>
+          <w:p>
+            <w:r>
+              <w:rPr>
+                <w:sz w:val="19"/>
+                <w:szCs w:val="19"/>
+              </w:rPr>
+              <w:t xml:space="preserve">Fait</w:t>
+            </w:r>
+          </w:p>
+        </w:tc>
+      </w:tr>
+      <w:tr>
+        <w:tc>
+          <w:tcPr>
+            <w:tcW w:w="7907" w:type="dxa"/>
+            <w:tcBorders>
+              <w:top w:val="single" w:sz="4" w:space="0" w:color="D8DCE3"/>
+              <w:left w:val="single" w:sz="4" w:space="0" w:color="D8DCE3"/>
+              <w:bottom w:val="single" w:sz="4" w:space="0" w:color="D8DCE3"/>
+              <w:right w:val="single" w:sz="4" w:space="0" w:color="D8DCE3"/>
+            </w:tcBorders>
+            <w:tcMar>
+              <w:top w:w="90" w:type="dxa"/>
+              <w:left w:w="120" w:type="dxa"/>
+              <w:bottom w:w="90" w:type="dxa"/>
+              <w:right w:w="120" w:type="dxa"/>
+            </w:tcMar>
+            <w:vAlign w:val="center"/>
+          </w:tcPr>
+          <w:p>
+            <w:r>
+              <w:rPr>
+                <w:b/>
+                <w:bCs/>
+                <w:sz w:val="19"/>
+                <w:szCs w:val="19"/>
+              </w:rPr>
+              <w:t xml:space="preserve">Mot de passe oublié par e-mail</w:t>
+            </w:r>
+          </w:p>
+        </w:tc>
+        <w:tc>
+          <w:tcPr>
+            <w:tcW w:w="2000" w:type="dxa"/>
+            <w:tcBorders>
+              <w:top w:val="single" w:sz="4" w:space="0" w:color="D8DCE3"/>
+              <w:left w:val="single" w:sz="4" w:space="0" w:color="D8DCE3"/>
+              <w:bottom w:val="single" w:sz="4" w:space="0" w:color="D8DCE3"/>
+              <w:right w:val="single" w:sz="4" w:space="0" w:color="D8DCE3"/>
+            </w:tcBorders>
+            <w:tcMar>
+              <w:top w:w="90" w:type="dxa"/>
+              <w:left w:w="120" w:type="dxa"/>
+              <w:bottom w:w="90" w:type="dxa"/>
+              <w:right w:w="120" w:type="dxa"/>
+            </w:tcMar>
+            <w:vAlign w:val="center"/>
+          </w:tcPr>
+          <w:p>
+            <w:r>
+              <w:rPr>
+                <w:sz w:val="19"/>
+                <w:szCs w:val="19"/>
+              </w:rPr>
+              <w:t xml:space="preserve">Fait</w:t>
+            </w:r>
+          </w:p>
+        </w:tc>
+      </w:tr>
+      <w:tr>
+        <w:tc>
+          <w:tcPr>
+            <w:tcW w:w="7907" w:type="dxa"/>
+            <w:tcBorders>
+              <w:top w:val="single" w:sz="4" w:space="0" w:color="D8DCE3"/>
+              <w:left w:val="single" w:sz="4" w:space="0" w:color="D8DCE3"/>
+              <w:bottom w:val="single" w:sz="4" w:space="0" w:color="D8DCE3"/>
+              <w:right w:val="single" w:sz="4" w:space="0" w:color="D8DCE3"/>
+            </w:tcBorders>
+            <w:tcMar>
+              <w:top w:w="90" w:type="dxa"/>
+              <w:left w:w="120" w:type="dxa"/>
+              <w:bottom w:w="90" w:type="dxa"/>
+              <w:right w:w="120" w:type="dxa"/>
+            </w:tcMar>
+            <w:vAlign w:val="center"/>
+          </w:tcPr>
+          <w:p>
+            <w:r>
+              <w:rPr>
+                <w:b/>
+                <w:bCs/>
+                <w:sz w:val="19"/>
+                <w:szCs w:val="19"/>
+              </w:rPr>
+              <w:t xml:space="preserve">Migrations de schéma versionnées (Flyway)</w:t>
             </w:r>
           </w:p>
         </w:tc>
@@ -7449,7 +7848,7 @@
         <w:spacing w:after="100"/>
       </w:pPr>
       <w:r>
-        <w:t xml:space="preserve">Envoi réel d'emails (réinitialisation de mot de passe, rappels d'activité).</w:t>
+        <w:t xml:space="preserve">Envoi d'e-mails pour les événements métier (assignation, rappels d'activité) ; la réinitialisation du mot de passe envoie déjà un e-mail.</w:t>
       </w:r>
     </w:p>
     <w:p>
@@ -7489,32 +7888,6 @@
       </w:pPr>
       <w:r>
         <w:t xml:space="preserve">Rappel quotidien également envoyé par e-mail (aujourd'hui : notification dans l'application).</w:t>
-      </w:r>
-    </w:p>
-    <w:p>
-      <w:pPr>
-        <w:pStyle w:val="Paragraphedeliste"/>
-        <w:numPr>
-          <w:ilvl w:val="0"/>
-          <w:numId w:val="3"/>
-        </w:numPr>
-        <w:spacing w:after="100"/>
-      </w:pPr>
-      <w:r>
-        <w:t xml:space="preserve">Pagination en base (requêtes JPQL paginées) au-delà de quelques milliers de lignes par liste ; aujourd'hui, la recherche et la pagination filtrent la liste déjà limitée au périmètre du rôle.</w:t>
-      </w:r>
-    </w:p>
-    <w:p>
-      <w:pPr>
-        <w:pStyle w:val="Paragraphedeliste"/>
-        <w:numPr>
-          <w:ilvl w:val="0"/>
-          <w:numId w:val="3"/>
-        </w:numPr>
-        <w:spacing w:after="100"/>
-      </w:pPr>
-      <w:r>
-        <w:t xml:space="preserve">Migrations de schéma versionnées (Flyway ou Liquibase) à la place de la mise à jour automatique par Hibernate, pour les mises à jour en production.</w:t>
       </w:r>
     </w:p>
     <w:p>
@@ -7712,7 +8085,7 @@
         <w:sz w:val="15"/>
         <w:szCs w:val="15"/>
       </w:rPr>
-      <w:t>Mame Codou Diouf — 25 septembre 2026</w:t>
+      <w:t>Mame Codou Diouf — 27 septembre 2026</w:t>
     </w:r>
     <w:r>
       <w:rPr>

</xml_diff>